<commit_message>
finished writing the code. made auto-encoder flexible for latent dimension and allowed subsetting the data. also added a metric for in-class variability, and a function for intra-class distance. still need to complete the report and create plots and results.
</commit_message>
<xml_diff>
--- a/exercise2/ex2.docx
+++ b/exercise2/ex2.docx
@@ -19,6 +19,7 @@
     </w:p>
     <w:p>
       <w:pPr>
+        <w:jc w:val="center"/>
         <w:rPr>
           <w:lang w:val="en-US"/>
         </w:rPr>
@@ -27,25 +28,6 @@
         <w:rPr>
           <w:lang w:val="en-US"/>
         </w:rPr>
-        <w:tab/>
-      </w:r>
-      <w:r>
-        <w:rPr>
-          <w:lang w:val="en-US"/>
-        </w:rPr>
-        <w:tab/>
-      </w:r>
-      <w:r>
-        <w:rPr>
-          <w:lang w:val="en-US"/>
-        </w:rPr>
-        <w:tab/>
-      </w:r>
-      <w:r>
-        <w:rPr>
-          <w:lang w:val="en-US"/>
-        </w:rPr>
-        <w:tab/>
         <w:t xml:space="preserve">Lior Kotlar – </w:t>
       </w:r>
       <w:proofErr w:type="spellStart"/>
@@ -112,6 +94,13 @@
         </w:rPr>
         <w:t>Part 1: Autoencoders</w:t>
       </w:r>
+    </w:p>
+    <w:p>
+      <w:pPr>
+        <w:rPr>
+          <w:lang w:val="en-US"/>
+        </w:rPr>
+      </w:pPr>
     </w:p>
     <w:p>
       <w:pPr>

</xml_diff>

<commit_message>
final finishes in code and finished writing first draft of report
</commit_message>
<xml_diff>
--- a/exercise2/ex2.docx
+++ b/exercise2/ex2.docx
@@ -84,28 +84,2569 @@
     <w:p>
       <w:pPr>
         <w:pStyle w:val="Heading2"/>
+      </w:pPr>
+      <w:r>
+        <w:t>Task</w:t>
+      </w:r>
+      <w:r>
+        <w:t xml:space="preserve"> 1: Autoencoders</w:t>
+      </w:r>
+    </w:p>
+    <w:p>
+      <w:r>
+        <w:t>In this task, we implemented a convolutional autoencoder to reconstruct images from the MNIST dataset through a compressed latent representation. The goal was to design an architecture that is both flexible and capable of generalizing across various configurations.</w:t>
+      </w:r>
+    </w:p>
+    <w:p>
+      <w:pPr>
+        <w:pStyle w:val="ListParagraph"/>
+        <w:numPr>
+          <w:ilvl w:val="0"/>
+          <w:numId w:val="1"/>
+        </w:numPr>
         <w:rPr>
           <w:lang w:val="en-US"/>
         </w:rPr>
       </w:pPr>
       <w:r>
+        <w:t xml:space="preserve">To ensure flexibility in latent space dimensionality, the encoder concludes with a </w:t>
+      </w:r>
+      <w:r>
+        <w:t xml:space="preserve">linear </w:t>
+      </w:r>
+      <w:proofErr w:type="gramStart"/>
+      <w:r>
+        <w:t>fully-connected</w:t>
+      </w:r>
+      <w:proofErr w:type="gramEnd"/>
+      <w:r>
+        <w:t xml:space="preserve"> </w:t>
+      </w:r>
+      <w:r>
+        <w:t xml:space="preserve">layer, which maps the final convolutional output (flattened) to any latent dimension </w:t>
+      </w:r>
+      <m:oMath>
+        <m:r>
+          <w:rPr>
+            <w:rFonts w:ascii="Cambria Math" w:hAnsi="Cambria Math"/>
+          </w:rPr>
+          <m:t>d</m:t>
+        </m:r>
+      </m:oMath>
+      <w:r>
+        <w:t>. Conversely, the decoder begins with a</w:t>
+      </w:r>
+      <w:r>
+        <w:t xml:space="preserve">n additional </w:t>
+      </w:r>
+      <w:proofErr w:type="gramStart"/>
+      <w:r>
+        <w:t>fully-connected</w:t>
+      </w:r>
+      <w:proofErr w:type="gramEnd"/>
+      <w:r>
+        <w:t xml:space="preserve"> </w:t>
+      </w:r>
+      <w:r>
+        <w:t xml:space="preserve">layer, mapping the latent vector back into the shape expected by the transposed convolutional layers. This design decouples the convolutional layers from the latent size, allowing arbitrary values of </w:t>
+      </w:r>
+      <m:oMath>
+        <m:r>
+          <w:rPr>
+            <w:rFonts w:ascii="Cambria Math" w:hAnsi="Cambria Math"/>
+          </w:rPr>
+          <m:t>d</m:t>
+        </m:r>
+      </m:oMath>
+      <w:r>
+        <w:t xml:space="preserve"> without structural changes to the convolutional layers.</w:t>
+      </w:r>
+    </w:p>
+    <w:p>
+      <w:pPr>
+        <w:pStyle w:val="ListParagraph"/>
+        <w:numPr>
+          <w:ilvl w:val="0"/>
+          <w:numId w:val="1"/>
+        </w:numPr>
+        <w:rPr>
+          <w:lang w:val="en-IL"/>
+        </w:rPr>
+      </w:pPr>
+      <w:r>
+        <w:rPr>
+          <w:lang w:val="en-IL"/>
+        </w:rPr>
+        <w:t>We explored two architectural settings:</w:t>
+      </w:r>
+    </w:p>
+    <w:p>
+      <w:pPr>
+        <w:pStyle w:val="ListParagraph"/>
+        <w:ind w:left="927"/>
+        <w:rPr>
+          <w:lang w:val="en-IL"/>
+        </w:rPr>
+      </w:pPr>
+      <w:r>
+        <w:rPr>
+          <w:b/>
+          <w:bCs/>
+          <w:lang w:val="en-IL"/>
+        </w:rPr>
+        <w:t>Small configuration</w:t>
+      </w:r>
+      <w:r>
+        <w:rPr>
+          <w:lang w:val="en-IL"/>
+        </w:rPr>
+        <w:t>:</w:t>
+      </w:r>
+      <w:r>
+        <w:rPr>
+          <w:lang w:val="en-IL"/>
+        </w:rPr>
+        <w:br/>
+      </w:r>
+      <w:r>
+        <w:rPr>
+          <w:lang w:val="en-IL"/>
+        </w:rPr>
+        <w:t>First layer: 4 channels</w:t>
+      </w:r>
+      <w:r>
+        <w:rPr>
+          <w:lang w:val="en-IL"/>
+        </w:rPr>
+        <w:t xml:space="preserve">, </w:t>
+      </w:r>
+      <w:r>
+        <w:rPr>
+          <w:lang w:val="en-IL"/>
+        </w:rPr>
+        <w:t>Intermediate layers: 5 and 6 channels</w:t>
+      </w:r>
+      <w:r>
+        <w:rPr>
+          <w:lang w:val="en-IL"/>
+        </w:rPr>
+        <w:t>.</w:t>
+      </w:r>
+    </w:p>
+    <w:p>
+      <w:pPr>
+        <w:pStyle w:val="ListParagraph"/>
+        <w:ind w:left="927"/>
+        <w:rPr>
+          <w:lang w:val="en-IL"/>
+        </w:rPr>
+      </w:pPr>
+      <w:r>
+        <w:rPr>
+          <w:b/>
+          <w:bCs/>
+          <w:lang w:val="en-IL"/>
+        </w:rPr>
+        <w:t>Large configuration:</w:t>
+      </w:r>
+    </w:p>
+    <w:p>
+      <w:pPr>
+        <w:pStyle w:val="ListParagraph"/>
+        <w:ind w:left="927"/>
+        <w:rPr>
+          <w:lang w:val="en-IL"/>
+        </w:rPr>
+      </w:pPr>
+      <w:r>
+        <w:rPr>
+          <w:lang w:val="en-IL"/>
+        </w:rPr>
+        <w:t>All convolutional layers use 16 channels</w:t>
+      </w:r>
+      <w:r>
+        <w:rPr>
+          <w:lang w:val="en-IL"/>
+        </w:rPr>
+        <w:t>.</w:t>
+      </w:r>
+    </w:p>
+    <w:p>
+      <w:pPr>
+        <w:pStyle w:val="ListParagraph"/>
+        <w:ind w:left="927"/>
+        <w:rPr>
+          <w:rFonts w:eastAsiaTheme="minorEastAsia"/>
+          <w:lang w:val="en-US" w:bidi="ar-JO"/>
+        </w:rPr>
+      </w:pPr>
+      <w:r>
+        <w:rPr>
+          <w:lang w:val="en-US" w:bidi="ar-JO"/>
+        </w:rPr>
+        <w:t xml:space="preserve">Both configurations were tested with both </w:t>
+      </w:r>
+      <m:oMath>
+        <m:r>
+          <w:rPr>
+            <w:rFonts w:ascii="Cambria Math" w:hAnsi="Cambria Math"/>
+            <w:lang w:val="en-US" w:bidi="ar-JO"/>
+          </w:rPr>
+          <m:t>d=4, d=16</m:t>
+        </m:r>
+      </m:oMath>
+      <w:r>
+        <w:rPr>
+          <w:rFonts w:eastAsiaTheme="minorEastAsia"/>
+          <w:lang w:val="en-US" w:bidi="ar-JO"/>
+        </w:rPr>
+        <w:t>.</w:t>
+      </w:r>
+    </w:p>
+    <w:p>
+      <w:pPr>
+        <w:pStyle w:val="ListParagraph"/>
+        <w:ind w:left="927"/>
+        <w:rPr>
+          <w:rFonts w:eastAsiaTheme="minorEastAsia"/>
+          <w:lang w:val="en-US" w:bidi="ar-JO"/>
+        </w:rPr>
+      </w:pPr>
+      <w:r>
+        <w:rPr>
+          <w:rFonts w:eastAsiaTheme="minorEastAsia"/>
+          <w:lang w:val="en-US" w:bidi="ar-JO"/>
+        </w:rPr>
+        <w:t>Here are the results of the reconstruction:</w:t>
+      </w:r>
+    </w:p>
+    <w:p>
+      <w:pPr>
+        <w:rPr>
+          <w:lang w:val="en-US" w:bidi="ar-JO"/>
+        </w:rPr>
+      </w:pPr>
+      <w:r>
+        <w:rPr>
+          <w:lang w:val="en-US" w:bidi="ar-JO"/>
+        </w:rPr>
+        <w:t>For the small model:</w:t>
+      </w:r>
+    </w:p>
+    <w:p>
+      <w:pPr>
+        <w:rPr>
+          <w:lang w:val="en-US" w:bidi="ar-JO"/>
+        </w:rPr>
+      </w:pPr>
+      <m:oMath>
+        <m:r>
+          <w:rPr>
+            <w:rFonts w:ascii="Cambria Math" w:hAnsi="Cambria Math"/>
+            <w:lang w:val="en-US" w:bidi="ar-JO"/>
+          </w:rPr>
+          <m:t>d=4</m:t>
+        </m:r>
+      </m:oMath>
+      <w:r>
+        <w:rPr>
+          <w:rFonts w:eastAsiaTheme="minorEastAsia"/>
+          <w:lang w:val="en-US" w:bidi="ar-JO"/>
+        </w:rPr>
+        <w:t>:</w:t>
+      </w:r>
+    </w:p>
+    <w:p>
+      <w:pPr>
+        <w:jc w:val="center"/>
+        <w:rPr>
+          <w:lang w:val="en-US" w:bidi="ar-JO"/>
+        </w:rPr>
+      </w:pPr>
+      <w:r>
+        <w:rPr>
+          <w:noProof/>
+        </w:rPr>
+        <w:drawing>
+          <wp:inline distT="0" distB="0" distL="0" distR="0" wp14:anchorId="392E9ACD" wp14:editId="65049D4A">
+            <wp:extent cx="3722914" cy="827406"/>
+            <wp:effectExtent l="0" t="0" r="0" b="0"/>
+            <wp:docPr id="1335959052" name="Picture 1" descr="A number in black squares&#10;&#10;AI-generated content may be incorrect."/>
+            <wp:cNvGraphicFramePr>
+              <a:graphicFrameLocks xmlns:a="http://schemas.openxmlformats.org/drawingml/2006/main" noChangeAspect="1"/>
+            </wp:cNvGraphicFramePr>
+            <a:graphic xmlns:a="http://schemas.openxmlformats.org/drawingml/2006/main">
+              <a:graphicData uri="http://schemas.openxmlformats.org/drawingml/2006/picture">
+                <pic:pic xmlns:pic="http://schemas.openxmlformats.org/drawingml/2006/picture">
+                  <pic:nvPicPr>
+                    <pic:cNvPr id="1335959052" name="Picture 1" descr="A number in black squares&#10;&#10;AI-generated content may be incorrect."/>
+                    <pic:cNvPicPr>
+                      <a:picLocks noChangeAspect="1" noChangeArrowheads="1"/>
+                    </pic:cNvPicPr>
+                  </pic:nvPicPr>
+                  <pic:blipFill>
+                    <a:blip r:embed="rId5">
+                      <a:extLst>
+                        <a:ext uri="{28A0092B-C50C-407E-A947-70E740481C1C}">
+                          <a14:useLocalDpi xmlns:a14="http://schemas.microsoft.com/office/drawing/2010/main" val="0"/>
+                        </a:ext>
+                      </a:extLst>
+                    </a:blip>
+                    <a:srcRect/>
+                    <a:stretch>
+                      <a:fillRect/>
+                    </a:stretch>
+                  </pic:blipFill>
+                  <pic:spPr bwMode="auto">
+                    <a:xfrm>
+                      <a:off x="0" y="0"/>
+                      <a:ext cx="3808764" cy="846486"/>
+                    </a:xfrm>
+                    <a:prstGeom prst="rect">
+                      <a:avLst/>
+                    </a:prstGeom>
+                    <a:noFill/>
+                    <a:ln>
+                      <a:noFill/>
+                    </a:ln>
+                  </pic:spPr>
+                </pic:pic>
+              </a:graphicData>
+            </a:graphic>
+          </wp:inline>
+        </w:drawing>
+      </w:r>
+    </w:p>
+    <w:p>
+      <w:pPr>
+        <w:rPr>
+          <w:rFonts w:eastAsiaTheme="minorEastAsia"/>
+          <w:lang w:val="en-US" w:bidi="ar-JO"/>
+        </w:rPr>
+      </w:pPr>
+      <m:oMath>
+        <m:r>
+          <w:rPr>
+            <w:rFonts w:ascii="Cambria Math" w:hAnsi="Cambria Math"/>
+            <w:lang w:val="en-US" w:bidi="ar-JO"/>
+          </w:rPr>
+          <m:t>d=16</m:t>
+        </m:r>
+      </m:oMath>
+      <w:r>
+        <w:rPr>
+          <w:rFonts w:eastAsiaTheme="minorEastAsia"/>
+          <w:lang w:val="en-US" w:bidi="ar-JO"/>
+        </w:rPr>
+        <w:t>:</w:t>
+      </w:r>
+    </w:p>
+    <w:p>
+      <w:pPr>
+        <w:jc w:val="center"/>
+        <w:rPr>
+          <w:lang w:val="en-US" w:bidi="ar-JO"/>
+        </w:rPr>
+      </w:pPr>
+      <w:r>
+        <w:rPr>
+          <w:noProof/>
+        </w:rPr>
+        <w:drawing>
+          <wp:inline distT="0" distB="0" distL="0" distR="0" wp14:anchorId="0C0EC7D2" wp14:editId="51633BE9">
+            <wp:extent cx="3722914" cy="827406"/>
+            <wp:effectExtent l="0" t="0" r="0" b="0"/>
+            <wp:docPr id="38413838" name="Picture 2" descr="A number in black squares&#10;&#10;AI-generated content may be incorrect."/>
+            <wp:cNvGraphicFramePr>
+              <a:graphicFrameLocks xmlns:a="http://schemas.openxmlformats.org/drawingml/2006/main" noChangeAspect="1"/>
+            </wp:cNvGraphicFramePr>
+            <a:graphic xmlns:a="http://schemas.openxmlformats.org/drawingml/2006/main">
+              <a:graphicData uri="http://schemas.openxmlformats.org/drawingml/2006/picture">
+                <pic:pic xmlns:pic="http://schemas.openxmlformats.org/drawingml/2006/picture">
+                  <pic:nvPicPr>
+                    <pic:cNvPr id="38413838" name="Picture 2" descr="A number in black squares&#10;&#10;AI-generated content may be incorrect."/>
+                    <pic:cNvPicPr>
+                      <a:picLocks noChangeAspect="1" noChangeArrowheads="1"/>
+                    </pic:cNvPicPr>
+                  </pic:nvPicPr>
+                  <pic:blipFill>
+                    <a:blip r:embed="rId6">
+                      <a:extLst>
+                        <a:ext uri="{28A0092B-C50C-407E-A947-70E740481C1C}">
+                          <a14:useLocalDpi xmlns:a14="http://schemas.microsoft.com/office/drawing/2010/main" val="0"/>
+                        </a:ext>
+                      </a:extLst>
+                    </a:blip>
+                    <a:srcRect/>
+                    <a:stretch>
+                      <a:fillRect/>
+                    </a:stretch>
+                  </pic:blipFill>
+                  <pic:spPr bwMode="auto">
+                    <a:xfrm>
+                      <a:off x="0" y="0"/>
+                      <a:ext cx="3830007" cy="851207"/>
+                    </a:xfrm>
+                    <a:prstGeom prst="rect">
+                      <a:avLst/>
+                    </a:prstGeom>
+                    <a:noFill/>
+                    <a:ln>
+                      <a:noFill/>
+                    </a:ln>
+                  </pic:spPr>
+                </pic:pic>
+              </a:graphicData>
+            </a:graphic>
+          </wp:inline>
+        </w:drawing>
+      </w:r>
+    </w:p>
+    <w:p>
+      <w:pPr>
+        <w:rPr>
+          <w:rFonts w:eastAsiaTheme="minorEastAsia"/>
+          <w:lang w:val="en-US" w:bidi="ar-JO"/>
+        </w:rPr>
+      </w:pPr>
+      <w:r>
+        <w:rPr>
+          <w:lang w:val="en-US" w:bidi="ar-JO"/>
+        </w:rPr>
+        <w:t>And for the large model:</w:t>
+      </w:r>
+      <w:r>
+        <w:rPr>
+          <w:lang w:val="en-US" w:bidi="ar-JO"/>
+        </w:rPr>
+        <w:br/>
+      </w:r>
+      <m:oMath>
+        <m:r>
+          <w:rPr>
+            <w:rFonts w:ascii="Cambria Math" w:hAnsi="Cambria Math"/>
+            <w:lang w:val="en-US" w:bidi="ar-JO"/>
+          </w:rPr>
+          <m:t>d=</m:t>
+        </m:r>
+        <m:r>
+          <w:rPr>
+            <w:rFonts w:ascii="Cambria Math" w:hAnsi="Cambria Math"/>
+            <w:lang w:val="en-US" w:bidi="ar-JO"/>
+          </w:rPr>
+          <m:t>4</m:t>
+        </m:r>
+      </m:oMath>
+      <w:r>
+        <w:rPr>
+          <w:rFonts w:eastAsiaTheme="minorEastAsia"/>
+          <w:lang w:val="en-US" w:bidi="ar-JO"/>
+        </w:rPr>
+        <w:t>:</w:t>
+      </w:r>
+    </w:p>
+    <w:p>
+      <w:pPr>
+        <w:jc w:val="center"/>
+        <w:rPr>
+          <w:lang w:val="en-US" w:bidi="ar-JO"/>
+        </w:rPr>
+      </w:pPr>
+      <w:r>
+        <w:rPr>
+          <w:noProof/>
+        </w:rPr>
+        <w:drawing>
+          <wp:inline distT="0" distB="0" distL="0" distR="0" wp14:anchorId="726C80DA" wp14:editId="01979CCE">
+            <wp:extent cx="3967402" cy="881743"/>
+            <wp:effectExtent l="0" t="0" r="0" b="0"/>
+            <wp:docPr id="140838242" name="Picture 3" descr="A number in black squares&#10;&#10;AI-generated content may be incorrect."/>
+            <wp:cNvGraphicFramePr>
+              <a:graphicFrameLocks xmlns:a="http://schemas.openxmlformats.org/drawingml/2006/main" noChangeAspect="1"/>
+            </wp:cNvGraphicFramePr>
+            <a:graphic xmlns:a="http://schemas.openxmlformats.org/drawingml/2006/main">
+              <a:graphicData uri="http://schemas.openxmlformats.org/drawingml/2006/picture">
+                <pic:pic xmlns:pic="http://schemas.openxmlformats.org/drawingml/2006/picture">
+                  <pic:nvPicPr>
+                    <pic:cNvPr id="140838242" name="Picture 3" descr="A number in black squares&#10;&#10;AI-generated content may be incorrect."/>
+                    <pic:cNvPicPr>
+                      <a:picLocks noChangeAspect="1" noChangeArrowheads="1"/>
+                    </pic:cNvPicPr>
+                  </pic:nvPicPr>
+                  <pic:blipFill>
+                    <a:blip r:embed="rId7">
+                      <a:extLst>
+                        <a:ext uri="{28A0092B-C50C-407E-A947-70E740481C1C}">
+                          <a14:useLocalDpi xmlns:a14="http://schemas.microsoft.com/office/drawing/2010/main" val="0"/>
+                        </a:ext>
+                      </a:extLst>
+                    </a:blip>
+                    <a:srcRect/>
+                    <a:stretch>
+                      <a:fillRect/>
+                    </a:stretch>
+                  </pic:blipFill>
+                  <pic:spPr bwMode="auto">
+                    <a:xfrm>
+                      <a:off x="0" y="0"/>
+                      <a:ext cx="4077955" cy="906313"/>
+                    </a:xfrm>
+                    <a:prstGeom prst="rect">
+                      <a:avLst/>
+                    </a:prstGeom>
+                    <a:noFill/>
+                    <a:ln>
+                      <a:noFill/>
+                    </a:ln>
+                  </pic:spPr>
+                </pic:pic>
+              </a:graphicData>
+            </a:graphic>
+          </wp:inline>
+        </w:drawing>
+      </w:r>
+      <w:r>
+        <w:rPr>
+          <w:rFonts w:eastAsiaTheme="minorEastAsia"/>
+          <w:lang w:val="en-US" w:bidi="ar-JO"/>
+        </w:rPr>
+        <w:br/>
+      </w:r>
+    </w:p>
+    <w:p>
+      <w:pPr>
+        <w:rPr>
+          <w:rFonts w:eastAsiaTheme="minorEastAsia"/>
+          <w:lang w:val="en-US" w:bidi="ar-JO"/>
+        </w:rPr>
+      </w:pPr>
+      <m:oMath>
+        <m:r>
+          <w:rPr>
+            <w:rFonts w:ascii="Cambria Math" w:hAnsi="Cambria Math"/>
+            <w:lang w:val="en-US" w:bidi="ar-JO"/>
+          </w:rPr>
+          <w:lastRenderedPageBreak/>
+          <m:t>d=16</m:t>
+        </m:r>
+      </m:oMath>
+      <w:r>
+        <w:rPr>
+          <w:rFonts w:eastAsiaTheme="minorEastAsia"/>
+          <w:lang w:val="en-US" w:bidi="ar-JO"/>
+        </w:rPr>
+        <w:t>:</w:t>
+      </w:r>
+    </w:p>
+    <w:p>
+      <w:pPr>
+        <w:jc w:val="center"/>
+        <w:rPr>
+          <w:lang w:val="en-US" w:bidi="ar-JO"/>
+        </w:rPr>
+      </w:pPr>
+      <w:r>
+        <w:rPr>
+          <w:noProof/>
+        </w:rPr>
+        <w:drawing>
+          <wp:inline distT="0" distB="0" distL="0" distR="0" wp14:anchorId="30A4BB7A" wp14:editId="5F77245B">
+            <wp:extent cx="4071257" cy="904824"/>
+            <wp:effectExtent l="0" t="0" r="5715" b="0"/>
+            <wp:docPr id="1237047062" name="Picture 4" descr="A black squares with numbers&#10;&#10;AI-generated content may be incorrect."/>
+            <wp:cNvGraphicFramePr>
+              <a:graphicFrameLocks xmlns:a="http://schemas.openxmlformats.org/drawingml/2006/main" noChangeAspect="1"/>
+            </wp:cNvGraphicFramePr>
+            <a:graphic xmlns:a="http://schemas.openxmlformats.org/drawingml/2006/main">
+              <a:graphicData uri="http://schemas.openxmlformats.org/drawingml/2006/picture">
+                <pic:pic xmlns:pic="http://schemas.openxmlformats.org/drawingml/2006/picture">
+                  <pic:nvPicPr>
+                    <pic:cNvPr id="1237047062" name="Picture 4" descr="A black squares with numbers&#10;&#10;AI-generated content may be incorrect."/>
+                    <pic:cNvPicPr>
+                      <a:picLocks noChangeAspect="1" noChangeArrowheads="1"/>
+                    </pic:cNvPicPr>
+                  </pic:nvPicPr>
+                  <pic:blipFill>
+                    <a:blip r:embed="rId8">
+                      <a:extLst>
+                        <a:ext uri="{28A0092B-C50C-407E-A947-70E740481C1C}">
+                          <a14:useLocalDpi xmlns:a14="http://schemas.microsoft.com/office/drawing/2010/main" val="0"/>
+                        </a:ext>
+                      </a:extLst>
+                    </a:blip>
+                    <a:srcRect/>
+                    <a:stretch>
+                      <a:fillRect/>
+                    </a:stretch>
+                  </pic:blipFill>
+                  <pic:spPr bwMode="auto">
+                    <a:xfrm>
+                      <a:off x="0" y="0"/>
+                      <a:ext cx="4103103" cy="911902"/>
+                    </a:xfrm>
+                    <a:prstGeom prst="rect">
+                      <a:avLst/>
+                    </a:prstGeom>
+                    <a:noFill/>
+                    <a:ln>
+                      <a:noFill/>
+                    </a:ln>
+                  </pic:spPr>
+                </pic:pic>
+              </a:graphicData>
+            </a:graphic>
+          </wp:inline>
+        </w:drawing>
+      </w:r>
+    </w:p>
+    <w:p>
+      <w:pPr>
+        <w:rPr>
+          <w:lang w:val="en-IL" w:bidi="ar-JO"/>
+        </w:rPr>
+      </w:pPr>
+      <w:r>
+        <w:rPr>
+          <w:lang w:val="en-IL" w:bidi="ar-JO"/>
+        </w:rPr>
+        <w:t xml:space="preserve">When </w:t>
+      </w:r>
+      <m:oMath>
+        <m:r>
+          <w:rPr>
+            <w:rFonts w:ascii="Cambria Math" w:hAnsi="Cambria Math"/>
+            <w:lang w:val="en-IL" w:bidi="ar-JO"/>
+          </w:rPr>
+          <m:t>d=4</m:t>
+        </m:r>
+      </m:oMath>
+      <w:r>
+        <w:rPr>
+          <w:lang w:val="en-IL" w:bidi="ar-JO"/>
+        </w:rPr>
+        <w:t>, the latent space is highly constrained, making it difficult for the model to encode sufficient information about the digit’s structure. As a result, reconstructions are blurry and often lose fine-grained features such as curves and edges.</w:t>
+      </w:r>
+    </w:p>
+    <w:p>
+      <w:pPr>
+        <w:rPr>
+          <w:lang w:val="en-IL" w:bidi="ar-JO"/>
+        </w:rPr>
+      </w:pPr>
+      <w:r>
+        <w:rPr>
+          <w:lang w:val="en-IL" w:bidi="ar-JO"/>
+        </w:rPr>
+        <w:t xml:space="preserve">Increasing the latent dimension to </w:t>
+      </w:r>
+      <m:oMath>
+        <m:r>
+          <w:rPr>
+            <w:rFonts w:ascii="Cambria Math" w:hAnsi="Cambria Math"/>
+            <w:lang w:val="en-IL" w:bidi="ar-JO"/>
+          </w:rPr>
+          <m:t>d=16</m:t>
+        </m:r>
+      </m:oMath>
+      <w:r>
+        <w:rPr>
+          <w:lang w:val="en-IL" w:bidi="ar-JO"/>
+        </w:rPr>
+        <w:t xml:space="preserve"> provides more capacity for encoding detailed and discriminative features. Although the quality is still not perfect, reconstructions preserve digit shape and structure much better, especially in the large network.</w:t>
+      </w:r>
+    </w:p>
+    <w:p>
+      <w:pPr>
+        <w:rPr>
+          <w:rStyle w:val="Strong"/>
+        </w:rPr>
+      </w:pPr>
+      <w:r>
+        <w:rPr>
+          <w:rStyle w:val="Strong"/>
+        </w:rPr>
+        <w:t>Network Architecture</w:t>
+      </w:r>
+    </w:p>
+    <w:p>
+      <w:pPr>
+        <w:pStyle w:val="ListParagraph"/>
+        <w:numPr>
+          <w:ilvl w:val="0"/>
+          <w:numId w:val="5"/>
+        </w:numPr>
+        <w:rPr>
+          <w:lang w:val="en-IL"/>
+        </w:rPr>
+      </w:pPr>
+      <w:r>
+        <w:rPr>
+          <w:lang w:val="en-IL"/>
+        </w:rPr>
+        <w:t>Encoder:</w:t>
+      </w:r>
+    </w:p>
+    <w:p>
+      <w:pPr>
+        <w:pStyle w:val="ListParagraph"/>
+        <w:numPr>
+          <w:ilvl w:val="1"/>
+          <w:numId w:val="5"/>
+        </w:numPr>
+        <w:rPr>
+          <w:lang w:val="en-IL"/>
+        </w:rPr>
+      </w:pPr>
+      <w:r>
+        <w:rPr>
+          <w:lang w:val="en-IL"/>
+        </w:rPr>
+        <w:t>3 convolutional layers with kernel size 3, stride 2, padding 1</w:t>
+      </w:r>
+    </w:p>
+    <w:p>
+      <w:pPr>
+        <w:pStyle w:val="ListParagraph"/>
+        <w:numPr>
+          <w:ilvl w:val="1"/>
+          <w:numId w:val="5"/>
+        </w:numPr>
+        <w:rPr>
+          <w:lang w:val="en-IL"/>
+        </w:rPr>
+      </w:pPr>
+      <w:r>
+        <w:rPr>
+          <w:lang w:val="en-IL"/>
+        </w:rPr>
+        <w:t>Reduces 28×28 input to a 4×4 feature map (after 3 stride-2 convolutions)</w:t>
+      </w:r>
+    </w:p>
+    <w:p>
+      <w:pPr>
+        <w:pStyle w:val="ListParagraph"/>
+        <w:numPr>
+          <w:ilvl w:val="1"/>
+          <w:numId w:val="5"/>
+        </w:numPr>
+        <w:rPr>
+          <w:lang w:val="en-IL"/>
+        </w:rPr>
+      </w:pPr>
+      <w:r>
+        <w:rPr>
+          <w:lang w:val="en-IL"/>
+        </w:rPr>
+        <w:t>AdaptiveAvgPool2</w:t>
+      </w:r>
+      <w:proofErr w:type="gramStart"/>
+      <w:r>
+        <w:rPr>
+          <w:lang w:val="en-IL"/>
+        </w:rPr>
+        <w:t>d(</w:t>
+      </w:r>
+      <w:proofErr w:type="gramEnd"/>
+      <w:r>
+        <w:rPr>
+          <w:lang w:val="en-IL"/>
+        </w:rPr>
+        <w:t>(1, 1)) used to collapse spatial dimensions</w:t>
+      </w:r>
+    </w:p>
+    <w:p>
+      <w:pPr>
+        <w:pStyle w:val="ListParagraph"/>
+        <w:numPr>
+          <w:ilvl w:val="1"/>
+          <w:numId w:val="5"/>
+        </w:numPr>
+        <w:rPr>
+          <w:lang w:val="en-IL"/>
+        </w:rPr>
+      </w:pPr>
+      <w:r>
+        <w:rPr>
+          <w:lang w:val="en-IL"/>
+        </w:rPr>
+        <w:t>Final Linear layer maps to latent dimension</w:t>
+      </w:r>
+    </w:p>
+    <w:p>
+      <w:pPr>
+        <w:pStyle w:val="ListParagraph"/>
+        <w:ind w:left="1440"/>
+        <w:rPr>
+          <w:lang w:val="en-IL"/>
+        </w:rPr>
+      </w:pPr>
+    </w:p>
+    <w:p>
+      <w:pPr>
+        <w:pStyle w:val="ListParagraph"/>
+        <w:numPr>
+          <w:ilvl w:val="0"/>
+          <w:numId w:val="5"/>
+        </w:numPr>
+        <w:rPr>
+          <w:lang w:val="en-IL"/>
+        </w:rPr>
+      </w:pPr>
+      <w:r>
+        <w:rPr>
+          <w:lang w:val="en-IL"/>
+        </w:rPr>
+        <w:t>Decoder:</w:t>
+      </w:r>
+    </w:p>
+    <w:p>
+      <w:pPr>
+        <w:pStyle w:val="ListParagraph"/>
+        <w:numPr>
+          <w:ilvl w:val="1"/>
+          <w:numId w:val="5"/>
+        </w:numPr>
+        <w:rPr>
+          <w:lang w:val="en-IL"/>
+        </w:rPr>
+      </w:pPr>
+      <w:r>
+        <w:rPr>
+          <w:lang w:val="en-IL"/>
+        </w:rPr>
+        <w:t xml:space="preserve">Starts with </w:t>
+      </w:r>
+      <w:proofErr w:type="gramStart"/>
+      <w:r>
+        <w:rPr>
+          <w:lang w:val="en-IL"/>
+        </w:rPr>
+        <w:t>Linear(</w:t>
+      </w:r>
+      <w:proofErr w:type="spellStart"/>
+      <w:proofErr w:type="gramEnd"/>
+      <w:r>
+        <w:rPr>
+          <w:lang w:val="en-IL"/>
+        </w:rPr>
+        <w:t>latent_dim</w:t>
+      </w:r>
+      <w:proofErr w:type="spellEnd"/>
+      <w:r>
+        <w:rPr>
+          <w:lang w:val="en-IL"/>
+        </w:rPr>
+        <w:t xml:space="preserve">, </w:t>
+      </w:r>
+      <w:proofErr w:type="spellStart"/>
+      <w:r>
+        <w:rPr>
+          <w:lang w:val="en-IL"/>
+        </w:rPr>
+        <w:t>third_layer_size</w:t>
+      </w:r>
+      <w:proofErr w:type="spellEnd"/>
+      <w:r>
+        <w:rPr>
+          <w:lang w:val="en-IL"/>
+        </w:rPr>
+        <w:t>) to lift latent vector</w:t>
+      </w:r>
+    </w:p>
+    <w:p>
+      <w:pPr>
+        <w:pStyle w:val="ListParagraph"/>
+        <w:numPr>
+          <w:ilvl w:val="1"/>
+          <w:numId w:val="5"/>
+        </w:numPr>
+        <w:rPr>
+          <w:lang w:val="en-IL"/>
+        </w:rPr>
+      </w:pPr>
+      <w:r>
+        <w:rPr>
+          <w:lang w:val="en-IL"/>
+        </w:rPr>
+        <w:t>Unflatten into shape (C,1,1)</w:t>
+      </w:r>
+    </w:p>
+    <w:p>
+      <w:pPr>
+        <w:pStyle w:val="ListParagraph"/>
+        <w:numPr>
+          <w:ilvl w:val="1"/>
+          <w:numId w:val="5"/>
+        </w:numPr>
+        <w:rPr>
+          <w:lang w:val="en-IL"/>
+        </w:rPr>
+      </w:pPr>
+      <w:r>
+        <w:rPr>
+          <w:lang w:val="en-IL"/>
+        </w:rPr>
+        <w:t>ConvTranspose2d layers expand the representation:</w:t>
+      </w:r>
+    </w:p>
+    <w:p>
+      <w:pPr>
+        <w:pStyle w:val="ListParagraph"/>
+        <w:numPr>
+          <w:ilvl w:val="1"/>
+          <w:numId w:val="5"/>
+        </w:numPr>
+        <w:rPr>
+          <w:lang w:val="en-IL"/>
+        </w:rPr>
+      </w:pPr>
+      <w:r>
+        <w:rPr>
+          <w:lang w:val="en-IL"/>
+        </w:rPr>
+        <w:t>First layer uses kernel size 7 to move from 1×1 to 7×7</w:t>
+      </w:r>
+    </w:p>
+    <w:p>
+      <w:pPr>
+        <w:pStyle w:val="ListParagraph"/>
+        <w:numPr>
+          <w:ilvl w:val="1"/>
+          <w:numId w:val="5"/>
+        </w:numPr>
+        <w:rPr>
+          <w:lang w:val="en-IL"/>
+        </w:rPr>
+      </w:pPr>
+      <w:r>
+        <w:rPr>
+          <w:lang w:val="en-IL"/>
+        </w:rPr>
+        <w:t>Followed by two stride-2 transposed convolutions with padding and output padding to restore 28×28 resolution</w:t>
+      </w:r>
+    </w:p>
+    <w:p>
+      <w:pPr>
+        <w:pStyle w:val="ListParagraph"/>
+        <w:numPr>
+          <w:ilvl w:val="1"/>
+          <w:numId w:val="5"/>
+        </w:numPr>
+        <w:rPr>
+          <w:lang w:val="en-IL"/>
+        </w:rPr>
+      </w:pPr>
+      <w:r>
+        <w:rPr>
+          <w:lang w:val="en-IL"/>
+        </w:rPr>
+        <w:t>Sigmoid activation at the output ensures pixel values are in [0,1]</w:t>
+      </w:r>
+    </w:p>
+    <w:p>
+      <w:pPr>
+        <w:pStyle w:val="ListParagraph"/>
+        <w:numPr>
+          <w:ilvl w:val="0"/>
+          <w:numId w:val="5"/>
+        </w:numPr>
+        <w:rPr>
+          <w:lang w:val="en-IL"/>
+        </w:rPr>
+      </w:pPr>
+      <w:r>
+        <w:rPr>
+          <w:lang w:val="en-IL"/>
+        </w:rPr>
+        <w:t>Non-linearity: ReLU was used in all hidden layers for stable training and faster convergence.</w:t>
+      </w:r>
+    </w:p>
+    <w:p>
+      <w:pPr>
+        <w:rPr>
+          <w:lang w:val="en-IL"/>
+        </w:rPr>
+      </w:pPr>
+      <w:r>
+        <w:rPr>
+          <w:lang w:val="en-IL"/>
+        </w:rPr>
+        <w:t>This architecture provides a good balance of compression, feature extraction, and reconstruction capability, and is modular enough to extend for classification tasks in later parts.</w:t>
+      </w:r>
+    </w:p>
+    <w:p>
+      <w:pPr>
+        <w:pStyle w:val="Heading2"/>
+        <w:rPr>
+          <w:rStyle w:val="Strong"/>
+          <w:b w:val="0"/>
+          <w:bCs w:val="0"/>
+        </w:rPr>
+      </w:pPr>
+    </w:p>
+    <w:p>
+      <w:pPr>
+        <w:pStyle w:val="Heading2"/>
+        <w:rPr>
+          <w:rStyle w:val="Strong"/>
+          <w:b w:val="0"/>
+          <w:bCs w:val="0"/>
+        </w:rPr>
+      </w:pPr>
+      <w:r>
+        <w:rPr>
+          <w:rStyle w:val="Strong"/>
+          <w:b w:val="0"/>
+          <w:bCs w:val="0"/>
+        </w:rPr>
+        <w:t>Task</w:t>
+      </w:r>
+      <w:r>
+        <w:rPr>
+          <w:rStyle w:val="Strong"/>
+          <w:b w:val="0"/>
+          <w:bCs w:val="0"/>
+        </w:rPr>
+        <w:t xml:space="preserve"> </w:t>
+      </w:r>
+      <w:proofErr w:type="gramStart"/>
+      <w:r>
+        <w:rPr>
+          <w:rStyle w:val="Strong"/>
+          <w:b w:val="0"/>
+          <w:bCs w:val="0"/>
+        </w:rPr>
+        <w:t>2 :</w:t>
+      </w:r>
+      <w:proofErr w:type="gramEnd"/>
+      <w:r>
+        <w:rPr>
+          <w:rStyle w:val="Strong"/>
+          <w:b w:val="0"/>
+          <w:bCs w:val="0"/>
+        </w:rPr>
+        <w:t xml:space="preserve"> Classifier</w:t>
+      </w:r>
+    </w:p>
+    <w:p>
+      <w:pPr>
+        <w:rPr>
+          <w:lang w:val="en-IL"/>
+        </w:rPr>
+      </w:pPr>
+      <w:r>
+        <w:rPr>
+          <w:lang w:val="en-IL"/>
+        </w:rPr>
+        <w:t>In this task, we extended the encoder from Task 1 into a digit classifier for MNIST. Specifically, we reused the convolutional encoder architecture and added a simple fully connected layer (MLP) that maps the latent representation to 10 output classes. The model was trained using cross-entropy loss in two settings:</w:t>
+      </w:r>
+    </w:p>
+    <w:p>
+      <w:pPr>
+        <w:numPr>
+          <w:ilvl w:val="0"/>
+          <w:numId w:val="6"/>
+        </w:numPr>
+        <w:rPr>
+          <w:lang w:val="en-IL"/>
+        </w:rPr>
+      </w:pPr>
+      <w:r>
+        <w:rPr>
+          <w:lang w:val="en-IL"/>
+        </w:rPr>
+        <w:t>Using the entire training set.</w:t>
+      </w:r>
+    </w:p>
+    <w:p>
+      <w:pPr>
+        <w:numPr>
+          <w:ilvl w:val="0"/>
+          <w:numId w:val="6"/>
+        </w:numPr>
+        <w:rPr>
+          <w:lang w:val="en-IL"/>
+        </w:rPr>
+      </w:pPr>
+      <w:r>
+        <w:rPr>
+          <w:lang w:val="en-IL"/>
+        </w:rPr>
+        <w:t>Using a random subset of 100 training examples.</w:t>
+      </w:r>
+    </w:p>
+    <w:p>
+      <w:pPr>
+        <w:rPr>
+          <w:lang w:val="en-IL"/>
+        </w:rPr>
+      </w:pPr>
+      <w:r>
+        <w:rPr>
+          <w:lang w:val="en-IL"/>
+        </w:rPr>
+        <w:br w:type="page"/>
+      </w:r>
+    </w:p>
+    <w:p>
+      <w:pPr>
+        <w:rPr>
+          <w:rStyle w:val="Strong"/>
+          <w:lang w:val="en-IL"/>
+        </w:rPr>
+      </w:pPr>
+      <w:r>
+        <w:rPr>
+          <w:rStyle w:val="Strong"/>
+          <w:lang w:val="en-IL"/>
+        </w:rPr>
+        <w:lastRenderedPageBreak/>
+        <w:t>Classifier Design</w:t>
+      </w:r>
+    </w:p>
+    <w:p>
+      <w:pPr>
+        <w:rPr>
+          <w:lang w:val="en-IL"/>
+        </w:rPr>
+      </w:pPr>
+      <w:r>
+        <w:rPr>
+          <w:lang w:val="en-IL"/>
+        </w:rPr>
+        <w:t>We kept the architecture modular and clean by maintaining separate classes for:</w:t>
+      </w:r>
+    </w:p>
+    <w:p>
+      <w:pPr>
+        <w:numPr>
+          <w:ilvl w:val="0"/>
+          <w:numId w:val="7"/>
+        </w:numPr>
+        <w:rPr>
+          <w:lang w:val="en-IL"/>
+        </w:rPr>
+      </w:pPr>
+      <w:r>
+        <w:rPr>
+          <w:u w:val="single"/>
+          <w:lang w:val="en-IL"/>
+        </w:rPr>
+        <w:t>Encoder</w:t>
+      </w:r>
+      <w:r>
+        <w:rPr>
+          <w:lang w:val="en-IL"/>
+        </w:rPr>
+        <w:t xml:space="preserve">: </w:t>
+      </w:r>
+      <w:r>
+        <w:rPr>
+          <w:lang w:val="en-IL"/>
+        </w:rPr>
+        <w:t>same encoder architecture</w:t>
+      </w:r>
+      <w:r>
+        <w:rPr>
+          <w:lang w:val="en-IL"/>
+        </w:rPr>
+        <w:t xml:space="preserve"> from Task 1.</w:t>
+      </w:r>
+      <w:r>
+        <w:rPr>
+          <w:lang w:val="en-IL"/>
+        </w:rPr>
+        <w:t xml:space="preserve"> Large model, </w:t>
+      </w:r>
+      <m:oMath>
+        <m:r>
+          <w:rPr>
+            <w:rFonts w:ascii="Cambria Math" w:hAnsi="Cambria Math"/>
+            <w:lang w:val="en-IL"/>
+          </w:rPr>
+          <m:t>d=16</m:t>
+        </m:r>
+      </m:oMath>
+      <w:r>
+        <w:rPr>
+          <w:rFonts w:eastAsiaTheme="minorEastAsia"/>
+          <w:lang w:val="en-IL"/>
+        </w:rPr>
+        <w:t>.</w:t>
+      </w:r>
+    </w:p>
+    <w:p>
+      <w:pPr>
+        <w:numPr>
+          <w:ilvl w:val="0"/>
+          <w:numId w:val="7"/>
+        </w:numPr>
+        <w:rPr>
+          <w:lang w:val="en-IL"/>
+        </w:rPr>
+      </w:pPr>
+      <w:proofErr w:type="spellStart"/>
+      <w:r>
+        <w:rPr>
+          <w:u w:val="single"/>
+          <w:lang w:val="en-IL"/>
+        </w:rPr>
+        <w:t>MLPClassifier</w:t>
+      </w:r>
+      <w:proofErr w:type="spellEnd"/>
+      <w:r>
+        <w:rPr>
+          <w:lang w:val="en-IL"/>
+        </w:rPr>
+        <w:t>: A fully connected layer that maps the latent vector to digit classes.</w:t>
+      </w:r>
+    </w:p>
+    <w:p>
+      <w:pPr>
+        <w:numPr>
+          <w:ilvl w:val="0"/>
+          <w:numId w:val="7"/>
+        </w:numPr>
+        <w:rPr>
+          <w:lang w:val="en-IL"/>
+        </w:rPr>
+      </w:pPr>
+      <w:proofErr w:type="spellStart"/>
+      <w:r>
+        <w:rPr>
+          <w:u w:val="single"/>
+          <w:lang w:val="en-IL"/>
+        </w:rPr>
+        <w:t>EncoderDecoder</w:t>
+      </w:r>
+      <w:proofErr w:type="spellEnd"/>
+      <w:r>
+        <w:rPr>
+          <w:lang w:val="en-IL"/>
+        </w:rPr>
+        <w:t xml:space="preserve">: A wrapper that combines the encoder with either a decoder (for reconstruction) or an MLP (for classification), controlled </w:t>
+      </w:r>
+      <w:r>
+        <w:rPr>
+          <w:lang w:val="en-IL"/>
+        </w:rPr>
+        <w:t>using</w:t>
+      </w:r>
+      <w:r>
+        <w:rPr>
+          <w:lang w:val="en-IL"/>
+        </w:rPr>
+        <w:t xml:space="preserve"> a </w:t>
+      </w:r>
+      <w:proofErr w:type="spellStart"/>
+      <w:r>
+        <w:rPr>
+          <w:lang w:val="en-IL"/>
+        </w:rPr>
+        <w:t>model_type</w:t>
+      </w:r>
+      <w:proofErr w:type="spellEnd"/>
+      <w:r>
+        <w:rPr>
+          <w:lang w:val="en-IL"/>
+        </w:rPr>
+        <w:t xml:space="preserve"> flag.</w:t>
+      </w:r>
+    </w:p>
+    <w:p>
+      <w:pPr>
+        <w:rPr>
+          <w:lang w:val="en-IL"/>
+        </w:rPr>
+      </w:pPr>
+      <w:r>
+        <w:rPr>
+          <w:lang w:val="en-IL"/>
+        </w:rPr>
+        <w:t>Here are the results in the end of the training:</w:t>
+      </w:r>
+    </w:p>
+    <w:p>
+      <w:pPr>
+        <w:rPr>
+          <w:lang w:val="en-IL"/>
+        </w:rPr>
+      </w:pPr>
+      <w:r>
+        <w:rPr>
+          <w:lang w:val="en-IL"/>
+        </w:rPr>
+        <w:t>Full training dataset:</w:t>
+      </w:r>
+    </w:p>
+    <w:p>
+      <w:pPr>
+        <w:jc w:val="center"/>
+        <w:rPr>
+          <w:lang w:val="en-IL"/>
+        </w:rPr>
+      </w:pPr>
+      <w:r>
+        <w:rPr>
+          <w:noProof/>
+        </w:rPr>
+        <w:drawing>
+          <wp:inline distT="0" distB="0" distL="0" distR="0" wp14:anchorId="40C13A37" wp14:editId="3EEEE793">
+            <wp:extent cx="3831771" cy="1596642"/>
+            <wp:effectExtent l="0" t="0" r="0" b="3810"/>
+            <wp:docPr id="985913479" name="Picture 6" descr="A graph of a graph of a graph of a graph of a graph of a graph of a graph of a graph of a graph of a graph of a graph of a graph of a graph of&#10;&#10;AI-generated content may be incorrect."/>
+            <wp:cNvGraphicFramePr>
+              <a:graphicFrameLocks xmlns:a="http://schemas.openxmlformats.org/drawingml/2006/main" noChangeAspect="1"/>
+            </wp:cNvGraphicFramePr>
+            <a:graphic xmlns:a="http://schemas.openxmlformats.org/drawingml/2006/main">
+              <a:graphicData uri="http://schemas.openxmlformats.org/drawingml/2006/picture">
+                <pic:pic xmlns:pic="http://schemas.openxmlformats.org/drawingml/2006/picture">
+                  <pic:nvPicPr>
+                    <pic:cNvPr id="985913479" name="Picture 6" descr="A graph of a graph of a graph of a graph of a graph of a graph of a graph of a graph of a graph of a graph of a graph of a graph of a graph of&#10;&#10;AI-generated content may be incorrect."/>
+                    <pic:cNvPicPr>
+                      <a:picLocks noChangeAspect="1" noChangeArrowheads="1"/>
+                    </pic:cNvPicPr>
+                  </pic:nvPicPr>
+                  <pic:blipFill>
+                    <a:blip r:embed="rId9" cstate="print">
+                      <a:extLst>
+                        <a:ext uri="{28A0092B-C50C-407E-A947-70E740481C1C}">
+                          <a14:useLocalDpi xmlns:a14="http://schemas.microsoft.com/office/drawing/2010/main" val="0"/>
+                        </a:ext>
+                      </a:extLst>
+                    </a:blip>
+                    <a:srcRect/>
+                    <a:stretch>
+                      <a:fillRect/>
+                    </a:stretch>
+                  </pic:blipFill>
+                  <pic:spPr bwMode="auto">
+                    <a:xfrm>
+                      <a:off x="0" y="0"/>
+                      <a:ext cx="3852812" cy="1605409"/>
+                    </a:xfrm>
+                    <a:prstGeom prst="rect">
+                      <a:avLst/>
+                    </a:prstGeom>
+                    <a:noFill/>
+                    <a:ln>
+                      <a:noFill/>
+                    </a:ln>
+                  </pic:spPr>
+                </pic:pic>
+              </a:graphicData>
+            </a:graphic>
+          </wp:inline>
+        </w:drawing>
+      </w:r>
+    </w:p>
+    <w:p>
+      <w:pPr>
+        <w:rPr>
+          <w:lang w:val="en-IL"/>
+        </w:rPr>
+      </w:pPr>
+      <w:r>
+        <w:rPr>
+          <w:lang w:val="en-IL"/>
+        </w:rPr>
+        <w:t>Only a subset of the training data:</w:t>
+      </w:r>
+    </w:p>
+    <w:p>
+      <w:pPr>
+        <w:jc w:val="center"/>
+        <w:rPr>
+          <w:lang w:val="en-IL"/>
+        </w:rPr>
+      </w:pPr>
+      <w:r>
+        <w:rPr>
+          <w:noProof/>
+        </w:rPr>
+        <w:drawing>
+          <wp:inline distT="0" distB="0" distL="0" distR="0" wp14:anchorId="4FE321F4" wp14:editId="002A1CC7">
+            <wp:extent cx="3804376" cy="1585227"/>
+            <wp:effectExtent l="0" t="0" r="5715" b="0"/>
+            <wp:docPr id="1472962455" name="Picture 5" descr="A graph of a graph&#10;&#10;AI-generated content may be incorrect."/>
+            <wp:cNvGraphicFramePr>
+              <a:graphicFrameLocks xmlns:a="http://schemas.openxmlformats.org/drawingml/2006/main" noChangeAspect="1"/>
+            </wp:cNvGraphicFramePr>
+            <a:graphic xmlns:a="http://schemas.openxmlformats.org/drawingml/2006/main">
+              <a:graphicData uri="http://schemas.openxmlformats.org/drawingml/2006/picture">
+                <pic:pic xmlns:pic="http://schemas.openxmlformats.org/drawingml/2006/picture">
+                  <pic:nvPicPr>
+                    <pic:cNvPr id="1472962455" name="Picture 5" descr="A graph of a graph&#10;&#10;AI-generated content may be incorrect."/>
+                    <pic:cNvPicPr>
+                      <a:picLocks noChangeAspect="1" noChangeArrowheads="1"/>
+                    </pic:cNvPicPr>
+                  </pic:nvPicPr>
+                  <pic:blipFill>
+                    <a:blip r:embed="rId10" cstate="print">
+                      <a:extLst>
+                        <a:ext uri="{28A0092B-C50C-407E-A947-70E740481C1C}">
+                          <a14:useLocalDpi xmlns:a14="http://schemas.microsoft.com/office/drawing/2010/main" val="0"/>
+                        </a:ext>
+                      </a:extLst>
+                    </a:blip>
+                    <a:srcRect/>
+                    <a:stretch>
+                      <a:fillRect/>
+                    </a:stretch>
+                  </pic:blipFill>
+                  <pic:spPr bwMode="auto">
+                    <a:xfrm>
+                      <a:off x="0" y="0"/>
+                      <a:ext cx="3821586" cy="1592398"/>
+                    </a:xfrm>
+                    <a:prstGeom prst="rect">
+                      <a:avLst/>
+                    </a:prstGeom>
+                    <a:noFill/>
+                    <a:ln>
+                      <a:noFill/>
+                    </a:ln>
+                  </pic:spPr>
+                </pic:pic>
+              </a:graphicData>
+            </a:graphic>
+          </wp:inline>
+        </w:drawing>
+      </w:r>
+    </w:p>
+    <w:p>
+      <w:pPr>
+        <w:rPr>
+          <w:lang w:val="en-IL"/>
+        </w:rPr>
+      </w:pPr>
+      <w:r>
+        <w:rPr>
+          <w:lang w:val="en-IL"/>
+        </w:rPr>
+        <w:t>The model trained using the full training set reached a ~98% accuracy and the model trained on 100 examples achieved ~1</w:t>
+      </w:r>
+      <w:r>
+        <w:rPr>
+          <w:lang w:val="en-IL"/>
+        </w:rPr>
+        <w:t>0</w:t>
+      </w:r>
+      <w:r>
+        <w:rPr>
+          <w:lang w:val="en-IL"/>
+        </w:rPr>
+        <w:t xml:space="preserve">% accuracy which is </w:t>
+      </w:r>
+      <w:r>
+        <w:rPr>
+          <w:lang w:val="en-IL"/>
+        </w:rPr>
+        <w:t>the expected accuracy from</w:t>
+      </w:r>
+      <w:r>
+        <w:rPr>
+          <w:lang w:val="en-IL"/>
+        </w:rPr>
+        <w:t xml:space="preserve"> random guessing.</w:t>
+      </w:r>
+    </w:p>
+    <w:p>
+      <w:pPr>
+        <w:rPr>
+          <w:rStyle w:val="Strong"/>
+          <w:b w:val="0"/>
+          <w:bCs w:val="0"/>
+        </w:rPr>
+      </w:pPr>
+      <w:r>
+        <w:rPr>
+          <w:rStyle w:val="Strong"/>
+        </w:rPr>
+        <w:t>Gap explanation:</w:t>
+      </w:r>
+    </w:p>
+    <w:p>
+      <w:r>
+        <w:rPr>
+          <w:rStyle w:val="Strong"/>
+          <w:b w:val="0"/>
+          <w:bCs w:val="0"/>
+        </w:rPr>
+        <w:t>With the full dataset (which is around 60,000 examples)</w:t>
+      </w:r>
+      <w:r>
+        <w:rPr>
+          <w:lang w:val="en-IL"/>
+        </w:rPr>
+        <w:t xml:space="preserve"> t</w:t>
+      </w:r>
+      <w:r>
+        <w:rPr>
+          <w:lang w:val="en-IL"/>
+        </w:rPr>
+        <w:t>he classifier had access to sufficient variety in handwriting styles, digit shapes, and noise patterns. This allowed the encoder to learn generalizable digit representations and the MLP to classify them accurately.</w:t>
+      </w:r>
+    </w:p>
+    <w:p>
+      <w:r>
+        <w:rPr>
+          <w:lang w:val="en-IL"/>
+        </w:rPr>
+        <w:t>On the other hand, w</w:t>
+      </w:r>
+      <w:r>
+        <w:rPr>
+          <w:lang w:val="en-IL"/>
+        </w:rPr>
+        <w:t>ith only 10 samples per class on average (and possibly less due to randomness), the model could not learn meaningful features or general decision boundaries. This led to poor generalization and nearly random classification accuracy on the test set.</w:t>
+      </w:r>
+    </w:p>
+    <w:p>
+      <w:pPr>
+        <w:rPr>
+          <w:lang w:val="en-IL"/>
+        </w:rPr>
+      </w:pPr>
+    </w:p>
+    <w:p>
+      <w:pPr>
+        <w:pStyle w:val="Heading2"/>
+        <w:rPr>
+          <w:lang w:val="en-IL"/>
+        </w:rPr>
+      </w:pPr>
+      <w:r>
+        <w:rPr>
+          <w:lang w:val="en-IL"/>
+        </w:rPr>
+        <w:lastRenderedPageBreak/>
+        <w:t>Task 3</w:t>
+      </w:r>
+    </w:p>
+    <w:p>
+      <w:pPr>
+        <w:rPr>
+          <w:lang w:val="en-IL"/>
+        </w:rPr>
+      </w:pPr>
+      <w:r>
+        <w:rPr>
+          <w:lang w:val="en-IL"/>
+        </w:rPr>
+        <w:t>While the encoder successfully captured some structural regularities in the MNIST data — as evidenced by the classifier reaching ~85% accuracy without any encoder fine-tuning — its performance fell short of the fully supervised model trained from scratch (~98% test accuracy).</w:t>
+      </w:r>
+    </w:p>
+    <w:p>
+      <w:pPr>
+        <w:rPr>
+          <w:lang w:val="en-IL"/>
+        </w:rPr>
+      </w:pPr>
+      <w:r>
+        <w:rPr>
+          <w:lang w:val="en-IL"/>
+        </w:rPr>
+        <w:t xml:space="preserve">Here are the graphs describing loss and accuracy across epochs. The model is the same as the model in task </w:t>
+      </w:r>
+      <w:r>
+        <w:rPr>
+          <w:lang w:val="en-IL"/>
+        </w:rPr>
+        <w:t>2</w:t>
+      </w:r>
+      <w:r>
+        <w:rPr>
+          <w:lang w:val="en-IL"/>
+        </w:rPr>
+        <w:t xml:space="preserve">, with the large </w:t>
+      </w:r>
+      <w:r>
+        <w:rPr>
+          <w:lang w:val="en-IL"/>
+        </w:rPr>
+        <w:t xml:space="preserve">model </w:t>
+      </w:r>
+      <w:r>
+        <w:rPr>
+          <w:lang w:val="en-IL"/>
+        </w:rPr>
+        <w:t xml:space="preserve">architecture and </w:t>
+      </w:r>
+      <m:oMath>
+        <m:r>
+          <w:rPr>
+            <w:rFonts w:ascii="Cambria Math" w:hAnsi="Cambria Math"/>
+            <w:lang w:val="en-IL"/>
+          </w:rPr>
+          <m:t>d=16</m:t>
+        </m:r>
+      </m:oMath>
+      <w:r>
+        <w:rPr>
+          <w:rFonts w:eastAsiaTheme="minorEastAsia"/>
+          <w:lang w:val="en-IL"/>
+        </w:rPr>
+        <w:t xml:space="preserve">, but using the fixed encoder weights from task </w:t>
+      </w:r>
+      <w:r>
+        <w:rPr>
+          <w:rFonts w:eastAsiaTheme="minorEastAsia"/>
+          <w:lang w:val="en-IL"/>
+        </w:rPr>
+        <w:t>1</w:t>
+      </w:r>
+      <w:r>
+        <w:rPr>
+          <w:rFonts w:eastAsiaTheme="minorEastAsia"/>
+          <w:lang w:val="en-IL"/>
+        </w:rPr>
+        <w:t>.</w:t>
+      </w:r>
+    </w:p>
+    <w:p>
+      <w:pPr>
+        <w:jc w:val="center"/>
+        <w:rPr>
+          <w:lang w:val="en-IL"/>
+        </w:rPr>
+      </w:pPr>
+      <w:r>
+        <w:rPr>
+          <w:noProof/>
+        </w:rPr>
+        <w:drawing>
+          <wp:inline distT="0" distB="0" distL="0" distR="0" wp14:anchorId="358656DC" wp14:editId="5E812467">
+            <wp:extent cx="4925786" cy="2052502"/>
+            <wp:effectExtent l="0" t="0" r="8255" b="5080"/>
+            <wp:docPr id="1217479797" name="Picture 7" descr="A graph of a graph of a graph&#10;&#10;AI-generated content may be incorrect."/>
+            <wp:cNvGraphicFramePr>
+              <a:graphicFrameLocks xmlns:a="http://schemas.openxmlformats.org/drawingml/2006/main" noChangeAspect="1"/>
+            </wp:cNvGraphicFramePr>
+            <a:graphic xmlns:a="http://schemas.openxmlformats.org/drawingml/2006/main">
+              <a:graphicData uri="http://schemas.openxmlformats.org/drawingml/2006/picture">
+                <pic:pic xmlns:pic="http://schemas.openxmlformats.org/drawingml/2006/picture">
+                  <pic:nvPicPr>
+                    <pic:cNvPr id="1217479797" name="Picture 7" descr="A graph of a graph of a graph&#10;&#10;AI-generated content may be incorrect."/>
+                    <pic:cNvPicPr>
+                      <a:picLocks noChangeAspect="1" noChangeArrowheads="1"/>
+                    </pic:cNvPicPr>
+                  </pic:nvPicPr>
+                  <pic:blipFill>
+                    <a:blip r:embed="rId11" cstate="print">
+                      <a:extLst>
+                        <a:ext uri="{28A0092B-C50C-407E-A947-70E740481C1C}">
+                          <a14:useLocalDpi xmlns:a14="http://schemas.microsoft.com/office/drawing/2010/main" val="0"/>
+                        </a:ext>
+                      </a:extLst>
+                    </a:blip>
+                    <a:srcRect/>
+                    <a:stretch>
+                      <a:fillRect/>
+                    </a:stretch>
+                  </pic:blipFill>
+                  <pic:spPr bwMode="auto">
+                    <a:xfrm>
+                      <a:off x="0" y="0"/>
+                      <a:ext cx="4943160" cy="2059742"/>
+                    </a:xfrm>
+                    <a:prstGeom prst="rect">
+                      <a:avLst/>
+                    </a:prstGeom>
+                    <a:noFill/>
+                    <a:ln>
+                      <a:noFill/>
+                    </a:ln>
+                  </pic:spPr>
+                </pic:pic>
+              </a:graphicData>
+            </a:graphic>
+          </wp:inline>
+        </w:drawing>
+      </w:r>
+    </w:p>
+    <w:p>
+      <w:pPr>
+        <w:rPr>
+          <w:lang w:val="en-IL"/>
+        </w:rPr>
+      </w:pPr>
+      <w:r>
+        <w:rPr>
+          <w:lang w:val="en-IL"/>
+        </w:rPr>
+        <w:t>This performance gap suggests that:</w:t>
+      </w:r>
+    </w:p>
+    <w:p>
+      <w:pPr>
+        <w:rPr>
+          <w:lang w:val="en-IL"/>
+        </w:rPr>
+      </w:pPr>
+      <w:r>
+        <w:t xml:space="preserve">Unsupervised representation learning is beneficial, as it allows reasonable classification performance without </w:t>
+      </w:r>
+      <w:r>
+        <w:t>labelled</w:t>
+      </w:r>
+      <w:r>
+        <w:t xml:space="preserve"> supervision.</w:t>
+      </w:r>
+      <w:r>
+        <w:t xml:space="preserve"> However, t</w:t>
+      </w:r>
+      <w:r>
+        <w:rPr>
+          <w:lang w:val="en-IL"/>
+        </w:rPr>
+        <w:t>ask-specific supervision is crucial for optimal performance on classification tasks</w:t>
+      </w:r>
+      <w:r>
+        <w:rPr>
+          <w:lang w:val="en-IL"/>
+        </w:rPr>
+        <w:t xml:space="preserve">. Apparently, the classifier learned different subtleties and features than the reconstruction encoder. </w:t>
+      </w:r>
+      <w:r>
+        <w:rPr>
+          <w:lang w:val="en-IL"/>
+        </w:rPr>
+        <w:t>The representations learned during reconstruction capture pixel-level similarity but may not be discriminative enough for digit classification without further fine-tuning.</w:t>
+      </w:r>
+    </w:p>
+    <w:p>
+      <w:pPr>
+        <w:rPr>
+          <w:lang w:val="en-IL"/>
+        </w:rPr>
+      </w:pPr>
+    </w:p>
+    <w:p>
+      <w:pPr>
+        <w:pStyle w:val="Heading2"/>
+        <w:rPr>
+          <w:lang w:val="en-IL"/>
+        </w:rPr>
+      </w:pPr>
+      <w:r>
+        <w:rPr>
+          <w:lang w:val="en-IL"/>
+        </w:rPr>
+        <w:t>Task 4</w:t>
+      </w:r>
+    </w:p>
+    <w:p>
+      <w:pPr>
+        <w:rPr>
+          <w:lang w:val="en-IL"/>
+        </w:rPr>
+      </w:pPr>
+      <w:r>
+        <w:rPr>
+          <w:lang w:val="en-IL"/>
+        </w:rPr>
+        <w:t>We compare two different encoder–decoder models for image reconstruction on MNIST:</w:t>
+      </w:r>
+    </w:p>
+    <w:p>
+      <w:pPr>
+        <w:rPr>
+          <w:lang w:val="en-IL"/>
+        </w:rPr>
+      </w:pPr>
+      <w:r>
+        <w:rPr>
+          <w:lang w:val="en-IL"/>
+        </w:rPr>
+        <w:t>Q</w:t>
+      </w:r>
+      <w:r>
+        <w:rPr>
+          <w:lang w:val="en-IL"/>
+        </w:rPr>
+        <w:t>1 Model: A conventional autoencoder trained end-to-end for reconstruction. Both the encoder and decoder are optimized together.</w:t>
+      </w:r>
+    </w:p>
+    <w:p>
+      <w:pPr>
+        <w:rPr>
+          <w:lang w:val="en-IL"/>
+        </w:rPr>
+      </w:pPr>
+      <w:r>
+        <w:rPr>
+          <w:lang w:val="en-IL"/>
+        </w:rPr>
+        <w:t>Q</w:t>
+      </w:r>
+      <w:r>
+        <w:rPr>
+          <w:lang w:val="en-IL"/>
+        </w:rPr>
+        <w:t>4 Model: A hybrid model where the encoder is pretrained for digit classification (from Task 2) and kept frozen, while only the decoder is trained for reconstruction.</w:t>
+      </w:r>
+    </w:p>
+    <w:p>
+      <w:pPr>
         <w:rPr>
           <w:lang w:val="en-US"/>
         </w:rPr>
-        <w:t>Part 1: Autoencoders</w:t>
-      </w:r>
-    </w:p>
-    <w:p>
-      <w:pPr>
+      </w:pPr>
+      <w:r>
+        <w:rPr>
+          <w:lang w:val="en-IL"/>
+        </w:rPr>
+        <w:t xml:space="preserve">Here is the performance review for the </w:t>
+      </w:r>
+      <w:r>
+        <w:rPr>
+          <w:lang w:val="en-IL"/>
+        </w:rPr>
+        <w:t>Q</w:t>
+      </w:r>
+      <w:r>
+        <w:rPr>
+          <w:lang w:val="en-IL"/>
+        </w:rPr>
+        <w:t>4 model:</w:t>
+      </w:r>
+      <w:r>
         <w:rPr>
           <w:lang w:val="en-US"/>
         </w:rPr>
-      </w:pPr>
+        <w:t xml:space="preserve"> </w:t>
+      </w:r>
     </w:p>
     <w:p>
       <w:pPr>
         <w:rPr>
           <w:lang w:val="en-US"/>
+        </w:rPr>
+      </w:pPr>
+      <w:r>
+        <w:rPr>
+          <w:lang w:val="en-US"/>
+        </w:rPr>
+        <w:br w:type="page"/>
+      </w:r>
+    </w:p>
+    <w:p>
+      <w:pPr>
+        <w:rPr>
+          <w:lang w:val="en-US"/>
+        </w:rPr>
+      </w:pPr>
+      <w:r>
+        <w:rPr>
+          <w:lang w:val="en-US"/>
+        </w:rPr>
+        <w:lastRenderedPageBreak/>
+        <w:t>First, training loss over epochs (the y axis is labelled ‘MSE Loss but it’s a mistake. It represents L1 Loss)</w:t>
+      </w:r>
+      <w:r>
+        <w:rPr>
+          <w:lang w:val="en-US"/>
+        </w:rPr>
+        <w:t>.</w:t>
+      </w:r>
+    </w:p>
+    <w:p>
+      <w:pPr>
+        <w:jc w:val="center"/>
+        <w:rPr>
+          <w:lang w:val="en-IL" w:bidi="ar-JO"/>
+        </w:rPr>
+      </w:pPr>
+      <w:r>
+        <w:rPr>
+          <w:noProof/>
+        </w:rPr>
+        <w:drawing>
+          <wp:inline distT="0" distB="0" distL="0" distR="0" wp14:anchorId="67CF55E3" wp14:editId="10F17359">
+            <wp:extent cx="2307874" cy="1442357"/>
+            <wp:effectExtent l="0" t="0" r="0" b="5715"/>
+            <wp:docPr id="665559664" name="Picture 8" descr="A graph with a line graph&#10;&#10;AI-generated content may be incorrect."/>
+            <wp:cNvGraphicFramePr>
+              <a:graphicFrameLocks xmlns:a="http://schemas.openxmlformats.org/drawingml/2006/main" noChangeAspect="1"/>
+            </wp:cNvGraphicFramePr>
+            <a:graphic xmlns:a="http://schemas.openxmlformats.org/drawingml/2006/main">
+              <a:graphicData uri="http://schemas.openxmlformats.org/drawingml/2006/picture">
+                <pic:pic xmlns:pic="http://schemas.openxmlformats.org/drawingml/2006/picture">
+                  <pic:nvPicPr>
+                    <pic:cNvPr id="665559664" name="Picture 8" descr="A graph with a line graph&#10;&#10;AI-generated content may be incorrect."/>
+                    <pic:cNvPicPr>
+                      <a:picLocks noChangeAspect="1" noChangeArrowheads="1"/>
+                    </pic:cNvPicPr>
+                  </pic:nvPicPr>
+                  <pic:blipFill>
+                    <a:blip r:embed="rId12" cstate="print">
+                      <a:extLst>
+                        <a:ext uri="{28A0092B-C50C-407E-A947-70E740481C1C}">
+                          <a14:useLocalDpi xmlns:a14="http://schemas.microsoft.com/office/drawing/2010/main" val="0"/>
+                        </a:ext>
+                      </a:extLst>
+                    </a:blip>
+                    <a:srcRect/>
+                    <a:stretch>
+                      <a:fillRect/>
+                    </a:stretch>
+                  </pic:blipFill>
+                  <pic:spPr bwMode="auto">
+                    <a:xfrm>
+                      <a:off x="0" y="0"/>
+                      <a:ext cx="2365876" cy="1478607"/>
+                    </a:xfrm>
+                    <a:prstGeom prst="rect">
+                      <a:avLst/>
+                    </a:prstGeom>
+                    <a:noFill/>
+                    <a:ln>
+                      <a:noFill/>
+                    </a:ln>
+                  </pic:spPr>
+                </pic:pic>
+              </a:graphicData>
+            </a:graphic>
+          </wp:inline>
+        </w:drawing>
+      </w:r>
+    </w:p>
+    <w:p>
+      <w:pPr>
+        <w:rPr>
+          <w:lang w:val="en-IL" w:bidi="ar-JO"/>
+        </w:rPr>
+      </w:pPr>
+      <w:r>
+        <w:rPr>
+          <w:lang w:val="en-IL" w:bidi="ar-JO"/>
+        </w:rPr>
+        <w:t>The Q1 autoencoder results in better reconstruction error — that is, it achieves a lower reconstruction loss compared to the Q4 hybrid model.</w:t>
+      </w:r>
+    </w:p>
+    <w:p>
+      <w:pPr>
+        <w:rPr>
+          <w:lang w:val="en-IL" w:bidi="ar-JO"/>
+        </w:rPr>
+      </w:pPr>
+      <w:r>
+        <w:rPr>
+          <w:lang w:val="en-IL" w:bidi="ar-JO"/>
+        </w:rPr>
+        <w:t xml:space="preserve">This is expected because in Q1, the encoder and decoder are trained </w:t>
+      </w:r>
+      <w:r>
+        <w:rPr>
+          <w:lang w:val="en-IL" w:bidi="ar-JO"/>
+        </w:rPr>
+        <w:t xml:space="preserve">together </w:t>
+      </w:r>
+      <w:r>
+        <w:rPr>
+          <w:lang w:val="en-IL" w:bidi="ar-JO"/>
+        </w:rPr>
+        <w:t xml:space="preserve">specifically to minimize reconstruction error. The encoder learns to produce latent representations that preserve spatial and pixel-level details relevant to image recovery, while the decoder learns to interpret those representations </w:t>
+      </w:r>
+      <w:r>
+        <w:rPr>
+          <w:lang w:val="en-IL" w:bidi="ar-JO"/>
+        </w:rPr>
+        <w:t>accordingly</w:t>
+      </w:r>
+      <w:r>
+        <w:rPr>
+          <w:lang w:val="en-IL" w:bidi="ar-JO"/>
+        </w:rPr>
+        <w:t>.</w:t>
+      </w:r>
+    </w:p>
+    <w:p>
+      <w:pPr>
+        <w:rPr>
+          <w:lang w:val="en-IL" w:bidi="ar-JO"/>
+        </w:rPr>
+      </w:pPr>
+      <w:r>
+        <w:rPr>
+          <w:lang w:val="en-IL" w:bidi="ar-JO"/>
+        </w:rPr>
+        <w:t>However,</w:t>
+      </w:r>
+      <w:r>
+        <w:rPr>
+          <w:lang w:val="en-IL" w:bidi="ar-JO"/>
+        </w:rPr>
+        <w:t xml:space="preserve"> in Q4, the encoder is trained for classification, not reconstruction. It learns to </w:t>
+      </w:r>
+      <w:r>
+        <w:rPr>
+          <w:lang w:val="en-IL" w:bidi="ar-JO"/>
+        </w:rPr>
+        <w:t>ignore</w:t>
+      </w:r>
+      <w:r>
+        <w:rPr>
+          <w:lang w:val="en-IL" w:bidi="ar-JO"/>
+        </w:rPr>
+        <w:t xml:space="preserve"> variations irrelevant to digit identity</w:t>
+      </w:r>
+      <w:r>
+        <w:rPr>
+          <w:lang w:val="en-IL" w:bidi="ar-JO"/>
+        </w:rPr>
+        <w:t xml:space="preserve"> and to notice more</w:t>
+      </w:r>
+      <w:r>
+        <w:rPr>
+          <w:lang w:val="en-IL" w:bidi="ar-JO"/>
+        </w:rPr>
+        <w:t xml:space="preserve"> abstract, discriminative features. These representations lack the detail necessary for high-</w:t>
+      </w:r>
+      <w:r>
+        <w:rPr>
+          <w:lang w:val="en-IL" w:bidi="ar-JO"/>
+        </w:rPr>
+        <w:t>quality</w:t>
+      </w:r>
+      <w:r>
+        <w:rPr>
+          <w:lang w:val="en-IL" w:bidi="ar-JO"/>
+        </w:rPr>
+        <w:t xml:space="preserve"> reconstruction. Since the decoder is the only trainable part, it is forced to reconstruct from a latent space not designed for this task — resulting in higher reconstruction error overall.</w:t>
+      </w:r>
+    </w:p>
+    <w:p>
+      <w:pPr>
+        <w:rPr>
+          <w:lang w:val="en-IL" w:bidi="ar-JO"/>
+        </w:rPr>
+      </w:pPr>
+    </w:p>
+    <w:p>
+      <w:pPr>
+        <w:rPr>
+          <w:rStyle w:val="Strong"/>
+          <w:lang w:val="en-IL" w:bidi="ar-JO"/>
+        </w:rPr>
+      </w:pPr>
+      <w:r>
+        <w:rPr>
+          <w:rStyle w:val="Strong"/>
+        </w:rPr>
+        <w:t>In-class variability</w:t>
+      </w:r>
+    </w:p>
+    <w:p>
+      <w:pPr>
+        <w:rPr>
+          <w:lang w:val="en-IL" w:bidi="ar-JO"/>
+        </w:rPr>
+      </w:pPr>
+      <w:r>
+        <w:rPr>
+          <w:lang w:val="en-IL" w:bidi="ar-JO"/>
+        </w:rPr>
+        <w:t>The Q4 model exhibits higher in-class variability</w:t>
+      </w:r>
+      <w:r>
+        <w:rPr>
+          <w:lang w:val="en-IL" w:bidi="ar-JO"/>
+        </w:rPr>
+        <w:t xml:space="preserve">. </w:t>
+      </w:r>
+      <w:r>
+        <w:rPr>
+          <w:lang w:val="en-IL" w:bidi="ar-JO"/>
+        </w:rPr>
+        <w:t>there is more visual variation among reconstructed images of the same digit class.</w:t>
+      </w:r>
+    </w:p>
+    <w:p>
+      <w:pPr>
+        <w:rPr>
+          <w:lang w:val="en-IL" w:bidi="ar-JO"/>
+        </w:rPr>
+      </w:pPr>
+      <w:r>
+        <w:rPr>
+          <w:lang w:val="en-IL" w:bidi="ar-JO"/>
+        </w:rPr>
+        <w:t xml:space="preserve">This happens because the frozen encoder used in Q4 was trained to </w:t>
+      </w:r>
+      <w:r>
+        <w:rPr>
+          <w:lang w:val="en-IL" w:bidi="ar-JO"/>
+        </w:rPr>
+        <w:t>make all instances of the same digit similar</w:t>
+      </w:r>
+      <w:r>
+        <w:rPr>
+          <w:lang w:val="en-IL" w:bidi="ar-JO"/>
+        </w:rPr>
+        <w:t xml:space="preserve"> in latent space, regardless of their stylistic differences. For example, a thin '2' and a thick '2' may be encoded similarly, </w:t>
+      </w:r>
+      <w:proofErr w:type="gramStart"/>
+      <w:r>
+        <w:rPr>
+          <w:lang w:val="en-IL" w:bidi="ar-JO"/>
+        </w:rPr>
+        <w:t>as long as</w:t>
+      </w:r>
+      <w:proofErr w:type="gramEnd"/>
+      <w:r>
+        <w:rPr>
+          <w:lang w:val="en-IL" w:bidi="ar-JO"/>
+        </w:rPr>
+        <w:t xml:space="preserve"> they are classifiable as '2'. This compression of intra-class variation leads to loss of detail in the latent representation.</w:t>
+      </w:r>
+    </w:p>
+    <w:p>
+      <w:pPr>
+        <w:rPr>
+          <w:lang w:val="en-IL" w:bidi="ar-JO"/>
+        </w:rPr>
+      </w:pPr>
+      <w:r>
+        <w:rPr>
+          <w:lang w:val="en-IL" w:bidi="ar-JO"/>
+        </w:rPr>
+        <w:t xml:space="preserve">In contrast, the Q1 autoencoder </w:t>
+      </w:r>
+      <w:r>
+        <w:rPr>
+          <w:lang w:val="en-IL" w:bidi="ar-JO"/>
+        </w:rPr>
+        <w:t>considers</w:t>
+      </w:r>
+      <w:r>
+        <w:rPr>
+          <w:lang w:val="en-IL" w:bidi="ar-JO"/>
+        </w:rPr>
+        <w:t xml:space="preserve"> subtle differences between inputs of the same digit, since it is trained to preserve all information necessary for pixel-level reconstruction</w:t>
+      </w:r>
+      <w:r>
+        <w:rPr>
+          <w:lang w:val="en-IL" w:bidi="ar-JO"/>
+        </w:rPr>
+        <w:t>, regardless of the digit label</w:t>
+      </w:r>
+      <w:r>
+        <w:rPr>
+          <w:lang w:val="en-IL" w:bidi="ar-JO"/>
+        </w:rPr>
+        <w:t>. Therefore, it tends to show more consistent reconstructions within each class.</w:t>
+      </w:r>
+    </w:p>
+    <w:p>
+      <w:pPr>
+        <w:rPr>
+          <w:lang w:val="en-IL" w:bidi="ar-JO"/>
+        </w:rPr>
+      </w:pPr>
+      <w:r>
+        <w:rPr>
+          <w:lang w:val="en-IL" w:bidi="ar-JO"/>
+        </w:rPr>
+        <w:br w:type="page"/>
+      </w:r>
+    </w:p>
+    <w:p>
+      <w:pPr>
+        <w:rPr>
+          <w:lang w:val="en-IL" w:bidi="ar-JO"/>
+        </w:rPr>
+      </w:pPr>
+      <w:r>
+        <w:rPr>
+          <w:lang w:val="en-IL" w:bidi="ar-JO"/>
+        </w:rPr>
+        <w:lastRenderedPageBreak/>
+        <w:t>Here are visualizations of the variability in each class. Each pair of images represents an original image and its reconstruction. Each lines represents a digit class.</w:t>
+      </w:r>
+    </w:p>
+    <w:p>
+      <w:pPr>
+        <w:rPr>
+          <w:lang w:val="en-IL" w:bidi="ar-JO"/>
+        </w:rPr>
+      </w:pPr>
+      <w:r>
+        <w:rPr>
+          <w:lang w:val="en-IL" w:bidi="ar-JO"/>
+        </w:rPr>
+        <w:t>The Q1 model is on the left, and the Q4 model is on the right.</w:t>
+      </w:r>
+    </w:p>
+    <w:p>
+      <w:pPr>
+        <w:rPr>
+          <w:lang w:val="en-IL" w:bidi="ar-JO"/>
+        </w:rPr>
+      </w:pPr>
+      <w:r>
+        <w:rPr>
+          <w:noProof/>
+        </w:rPr>
+        <w:drawing>
+          <wp:inline distT="0" distB="0" distL="0" distR="0" wp14:anchorId="400D4BA7" wp14:editId="45EDF5E4">
+            <wp:extent cx="2079172" cy="2079172"/>
+            <wp:effectExtent l="0" t="0" r="0" b="0"/>
+            <wp:docPr id="109947389" name="Picture 10" descr="A collage of numbers&#10;&#10;AI-generated content may be incorrect."/>
+            <wp:cNvGraphicFramePr>
+              <a:graphicFrameLocks xmlns:a="http://schemas.openxmlformats.org/drawingml/2006/main" noChangeAspect="1"/>
+            </wp:cNvGraphicFramePr>
+            <a:graphic xmlns:a="http://schemas.openxmlformats.org/drawingml/2006/main">
+              <a:graphicData uri="http://schemas.openxmlformats.org/drawingml/2006/picture">
+                <pic:pic xmlns:pic="http://schemas.openxmlformats.org/drawingml/2006/picture">
+                  <pic:nvPicPr>
+                    <pic:cNvPr id="109947389" name="Picture 10" descr="A collage of numbers&#10;&#10;AI-generated content may be incorrect."/>
+                    <pic:cNvPicPr>
+                      <a:picLocks noChangeAspect="1" noChangeArrowheads="1"/>
+                    </pic:cNvPicPr>
+                  </pic:nvPicPr>
+                  <pic:blipFill>
+                    <a:blip r:embed="rId13" cstate="print">
+                      <a:extLst>
+                        <a:ext uri="{28A0092B-C50C-407E-A947-70E740481C1C}">
+                          <a14:useLocalDpi xmlns:a14="http://schemas.microsoft.com/office/drawing/2010/main" val="0"/>
+                        </a:ext>
+                      </a:extLst>
+                    </a:blip>
+                    <a:srcRect/>
+                    <a:stretch>
+                      <a:fillRect/>
+                    </a:stretch>
+                  </pic:blipFill>
+                  <pic:spPr bwMode="auto">
+                    <a:xfrm>
+                      <a:off x="0" y="0"/>
+                      <a:ext cx="2082371" cy="2082371"/>
+                    </a:xfrm>
+                    <a:prstGeom prst="rect">
+                      <a:avLst/>
+                    </a:prstGeom>
+                    <a:noFill/>
+                    <a:ln>
+                      <a:noFill/>
+                    </a:ln>
+                  </pic:spPr>
+                </pic:pic>
+              </a:graphicData>
+            </a:graphic>
+          </wp:inline>
+        </w:drawing>
+      </w:r>
+      <w:r>
+        <w:rPr>
+          <w:lang w:val="en-IL" w:bidi="ar-JO"/>
+        </w:rPr>
+        <w:t xml:space="preserve">                              </w:t>
+      </w:r>
+      <w:r>
+        <w:rPr>
+          <w:noProof/>
+        </w:rPr>
+        <w:drawing>
+          <wp:inline distT="0" distB="0" distL="0" distR="0" wp14:anchorId="10B23214" wp14:editId="6E5820C4">
+            <wp:extent cx="2078718" cy="2078718"/>
+            <wp:effectExtent l="0" t="0" r="0" b="0"/>
+            <wp:docPr id="2022076852" name="Picture 9" descr="A collage of numbers&#10;&#10;AI-generated content may be incorrect."/>
+            <wp:cNvGraphicFramePr>
+              <a:graphicFrameLocks xmlns:a="http://schemas.openxmlformats.org/drawingml/2006/main" noChangeAspect="1"/>
+            </wp:cNvGraphicFramePr>
+            <a:graphic xmlns:a="http://schemas.openxmlformats.org/drawingml/2006/main">
+              <a:graphicData uri="http://schemas.openxmlformats.org/drawingml/2006/picture">
+                <pic:pic xmlns:pic="http://schemas.openxmlformats.org/drawingml/2006/picture">
+                  <pic:nvPicPr>
+                    <pic:cNvPr id="2022076852" name="Picture 9" descr="A collage of numbers&#10;&#10;AI-generated content may be incorrect."/>
+                    <pic:cNvPicPr>
+                      <a:picLocks noChangeAspect="1" noChangeArrowheads="1"/>
+                    </pic:cNvPicPr>
+                  </pic:nvPicPr>
+                  <pic:blipFill>
+                    <a:blip r:embed="rId14" cstate="print">
+                      <a:extLst>
+                        <a:ext uri="{28A0092B-C50C-407E-A947-70E740481C1C}">
+                          <a14:useLocalDpi xmlns:a14="http://schemas.microsoft.com/office/drawing/2010/main" val="0"/>
+                        </a:ext>
+                      </a:extLst>
+                    </a:blip>
+                    <a:srcRect/>
+                    <a:stretch>
+                      <a:fillRect/>
+                    </a:stretch>
+                  </pic:blipFill>
+                  <pic:spPr bwMode="auto">
+                    <a:xfrm>
+                      <a:off x="0" y="0"/>
+                      <a:ext cx="2088050" cy="2088050"/>
+                    </a:xfrm>
+                    <a:prstGeom prst="rect">
+                      <a:avLst/>
+                    </a:prstGeom>
+                    <a:noFill/>
+                    <a:ln>
+                      <a:noFill/>
+                    </a:ln>
+                  </pic:spPr>
+                </pic:pic>
+              </a:graphicData>
+            </a:graphic>
+          </wp:inline>
+        </w:drawing>
+      </w:r>
+    </w:p>
+    <w:p>
+      <w:pPr>
+        <w:rPr>
+          <w:lang w:val="en-IL" w:bidi="ar-JO"/>
+        </w:rPr>
+      </w:pPr>
+    </w:p>
+    <w:p>
+      <w:pPr>
+        <w:rPr>
+          <w:rStyle w:val="Strong"/>
+        </w:rPr>
+      </w:pPr>
+      <w:r>
+        <w:rPr>
+          <w:rStyle w:val="Strong"/>
+        </w:rPr>
+        <w:t>Intra-class distance</w:t>
+      </w:r>
+    </w:p>
+    <w:p>
+      <w:pPr>
+        <w:rPr>
+          <w:lang w:val="en-IL" w:bidi="ar-JO"/>
+        </w:rPr>
+      </w:pPr>
+      <w:r>
+        <w:rPr>
+          <w:lang w:val="en-IL" w:bidi="ar-JO"/>
+        </w:rPr>
+        <w:t xml:space="preserve">The Q4 model </w:t>
+      </w:r>
+      <w:r>
+        <w:rPr>
+          <w:lang w:val="en-IL" w:bidi="ar-JO"/>
+        </w:rPr>
+        <w:t>shows</w:t>
+      </w:r>
+      <w:r>
+        <w:rPr>
+          <w:lang w:val="en-IL" w:bidi="ar-JO"/>
+        </w:rPr>
+        <w:t xml:space="preserve"> higher inter-class separation in the latent space.</w:t>
+      </w:r>
+    </w:p>
+    <w:p>
+      <w:pPr>
+        <w:rPr>
+          <w:lang w:val="en-IL" w:bidi="ar-JO"/>
+        </w:rPr>
+      </w:pPr>
+      <w:r>
+        <w:rPr>
+          <w:lang w:val="en-IL" w:bidi="ar-JO"/>
+        </w:rPr>
+        <w:t xml:space="preserve">This outcome is expected because the encoder in Q4 was trained </w:t>
+      </w:r>
+      <w:r>
+        <w:rPr>
+          <w:lang w:val="en-IL" w:bidi="ar-JO"/>
+        </w:rPr>
+        <w:t xml:space="preserve">specifically </w:t>
+      </w:r>
+      <w:r>
+        <w:rPr>
+          <w:lang w:val="en-IL" w:bidi="ar-JO"/>
+        </w:rPr>
+        <w:t xml:space="preserve">for classification. As a result, it learns to </w:t>
+      </w:r>
+      <w:r>
+        <w:rPr>
+          <w:lang w:val="en-IL" w:bidi="ar-JO"/>
+        </w:rPr>
+        <w:t>encode</w:t>
+      </w:r>
+      <w:r>
+        <w:rPr>
+          <w:lang w:val="en-IL" w:bidi="ar-JO"/>
+        </w:rPr>
+        <w:t xml:space="preserve"> images of different digit classes to well-separated regions in latent space, maximizing discriminability between classes. This structured separation is clearly visible when visualized using t-SNE, where clusters corresponding to different digits are well-isolated.</w:t>
+      </w:r>
+    </w:p>
+    <w:p>
+      <w:pPr>
+        <w:rPr>
+          <w:lang w:val="en-IL" w:bidi="ar-JO"/>
+        </w:rPr>
+      </w:pPr>
+      <w:r>
+        <w:rPr>
+          <w:lang w:val="en-IL" w:bidi="ar-JO"/>
+        </w:rPr>
+        <w:t>In contrast, the encoder in Q1 is optimized only for reconstruction, not for class separation. Digits that share visual similarity (e.g., 3 and 8, or 4 and 9) may have overlapping latent representations. The latent space here is organized more around reconstructive similarity than semantic class boundaries, leading to lower inter-class separation.</w:t>
+      </w:r>
+    </w:p>
+    <w:p>
+      <w:pPr>
+        <w:rPr>
+          <w:lang w:val="en-IL" w:bidi="ar-JO"/>
+        </w:rPr>
+      </w:pPr>
+    </w:p>
+    <w:p>
+      <w:pPr>
+        <w:rPr>
+          <w:lang w:val="en-IL" w:bidi="ar-JO"/>
+        </w:rPr>
+      </w:pPr>
+      <w:r>
+        <w:rPr>
+          <w:lang w:val="en-IL" w:bidi="ar-JO"/>
+        </w:rPr>
+        <w:t xml:space="preserve">Here are the latent vectors’ </w:t>
+      </w:r>
+      <w:r>
+        <w:rPr>
+          <w:lang w:val="en-IL" w:bidi="ar-JO"/>
+        </w:rPr>
+        <w:t>t-SNE representation</w:t>
+      </w:r>
+      <w:r>
+        <w:rPr>
+          <w:lang w:val="en-IL" w:bidi="ar-JO"/>
+        </w:rPr>
+        <w:t xml:space="preserve"> in model Q1 (on the left) and Q4 (on the right):</w:t>
+      </w:r>
+    </w:p>
+    <w:p>
+      <w:pPr>
+        <w:rPr>
+          <w:lang w:val="en-IL" w:bidi="ar-JO"/>
+        </w:rPr>
+      </w:pPr>
+      <w:r>
+        <w:rPr>
+          <w:noProof/>
+        </w:rPr>
+        <w:drawing>
+          <wp:inline distT="0" distB="0" distL="0" distR="0" wp14:anchorId="4913F576" wp14:editId="6DC9FF94">
+            <wp:extent cx="2656114" cy="2124951"/>
+            <wp:effectExtent l="0" t="0" r="0" b="8890"/>
+            <wp:docPr id="322013045" name="Picture 11" descr="A colorful dots on a white background&#10;&#10;AI-generated content may be incorrect."/>
+            <wp:cNvGraphicFramePr>
+              <a:graphicFrameLocks xmlns:a="http://schemas.openxmlformats.org/drawingml/2006/main" noChangeAspect="1"/>
+            </wp:cNvGraphicFramePr>
+            <a:graphic xmlns:a="http://schemas.openxmlformats.org/drawingml/2006/main">
+              <a:graphicData uri="http://schemas.openxmlformats.org/drawingml/2006/picture">
+                <pic:pic xmlns:pic="http://schemas.openxmlformats.org/drawingml/2006/picture">
+                  <pic:nvPicPr>
+                    <pic:cNvPr id="322013045" name="Picture 11" descr="A colorful dots on a white background&#10;&#10;AI-generated content may be incorrect."/>
+                    <pic:cNvPicPr>
+                      <a:picLocks noChangeAspect="1" noChangeArrowheads="1"/>
+                    </pic:cNvPicPr>
+                  </pic:nvPicPr>
+                  <pic:blipFill>
+                    <a:blip r:embed="rId15" cstate="print">
+                      <a:extLst>
+                        <a:ext uri="{28A0092B-C50C-407E-A947-70E740481C1C}">
+                          <a14:useLocalDpi xmlns:a14="http://schemas.microsoft.com/office/drawing/2010/main" val="0"/>
+                        </a:ext>
+                      </a:extLst>
+                    </a:blip>
+                    <a:srcRect/>
+                    <a:stretch>
+                      <a:fillRect/>
+                    </a:stretch>
+                  </pic:blipFill>
+                  <pic:spPr bwMode="auto">
+                    <a:xfrm>
+                      <a:off x="0" y="0"/>
+                      <a:ext cx="2666714" cy="2133431"/>
+                    </a:xfrm>
+                    <a:prstGeom prst="rect">
+                      <a:avLst/>
+                    </a:prstGeom>
+                    <a:noFill/>
+                    <a:ln>
+                      <a:noFill/>
+                    </a:ln>
+                  </pic:spPr>
+                </pic:pic>
+              </a:graphicData>
+            </a:graphic>
+          </wp:inline>
+        </w:drawing>
+      </w:r>
+      <w:r>
+        <w:t xml:space="preserve"> </w:t>
+      </w:r>
+      <w:r>
+        <w:rPr>
+          <w:noProof/>
+        </w:rPr>
+        <w:drawing>
+          <wp:inline distT="0" distB="0" distL="0" distR="0" wp14:anchorId="4BEF52C6" wp14:editId="79CDF8AD">
+            <wp:extent cx="2618014" cy="2094469"/>
+            <wp:effectExtent l="0" t="0" r="0" b="1270"/>
+            <wp:docPr id="865927322" name="Picture 12" descr="A colorful dots in a circle&#10;&#10;AI-generated content may be incorrect."/>
+            <wp:cNvGraphicFramePr>
+              <a:graphicFrameLocks xmlns:a="http://schemas.openxmlformats.org/drawingml/2006/main" noChangeAspect="1"/>
+            </wp:cNvGraphicFramePr>
+            <a:graphic xmlns:a="http://schemas.openxmlformats.org/drawingml/2006/main">
+              <a:graphicData uri="http://schemas.openxmlformats.org/drawingml/2006/picture">
+                <pic:pic xmlns:pic="http://schemas.openxmlformats.org/drawingml/2006/picture">
+                  <pic:nvPicPr>
+                    <pic:cNvPr id="865927322" name="Picture 12" descr="A colorful dots in a circle&#10;&#10;AI-generated content may be incorrect."/>
+                    <pic:cNvPicPr>
+                      <a:picLocks noChangeAspect="1" noChangeArrowheads="1"/>
+                    </pic:cNvPicPr>
+                  </pic:nvPicPr>
+                  <pic:blipFill>
+                    <a:blip r:embed="rId16" cstate="print">
+                      <a:extLst>
+                        <a:ext uri="{28A0092B-C50C-407E-A947-70E740481C1C}">
+                          <a14:useLocalDpi xmlns:a14="http://schemas.microsoft.com/office/drawing/2010/main" val="0"/>
+                        </a:ext>
+                      </a:extLst>
+                    </a:blip>
+                    <a:srcRect/>
+                    <a:stretch>
+                      <a:fillRect/>
+                    </a:stretch>
+                  </pic:blipFill>
+                  <pic:spPr bwMode="auto">
+                    <a:xfrm>
+                      <a:off x="0" y="0"/>
+                      <a:ext cx="2621500" cy="2097258"/>
+                    </a:xfrm>
+                    <a:prstGeom prst="rect">
+                      <a:avLst/>
+                    </a:prstGeom>
+                    <a:noFill/>
+                    <a:ln>
+                      <a:noFill/>
+                    </a:ln>
+                  </pic:spPr>
+                </pic:pic>
+              </a:graphicData>
+            </a:graphic>
+          </wp:inline>
+        </w:drawing>
+      </w:r>
+    </w:p>
+    <w:p>
+      <w:pPr>
+        <w:rPr>
+          <w:rStyle w:val="Strong"/>
+          <w:rtl/>
+          <w:lang w:val="en-IL" w:bidi="ar-JO"/>
         </w:rPr>
       </w:pPr>
     </w:p>
@@ -117,6 +2658,1247 @@
     </w:sectPr>
   </w:body>
 </w:document>
+</file>
+
+<file path=word/numbering.xml><?xml version="1.0" encoding="utf-8"?>
+<w:numbering xmlns:wpc="http://schemas.microsoft.com/office/word/2010/wordprocessingCanvas" xmlns:cx="http://schemas.microsoft.com/office/drawing/2014/chartex" xmlns:cx1="http://schemas.microsoft.com/office/drawing/2015/9/8/chartex" xmlns:cx2="http://schemas.microsoft.com/office/drawing/2015/10/21/chartex" xmlns:cx3="http://schemas.microsoft.com/office/drawing/2016/5/9/chartex" xmlns:cx4="http://schemas.microsoft.com/office/drawing/2016/5/10/chartex" xmlns:cx5="http://schemas.microsoft.com/office/drawing/2016/5/11/chartex" xmlns:cx6="http://schemas.microsoft.com/office/drawing/2016/5/12/chartex" xmlns:cx7="http://schemas.microsoft.com/office/drawing/2016/5/13/chartex" xmlns:cx8="http://schemas.microsoft.com/office/drawing/2016/5/14/chartex" xmlns:mc="http://schemas.openxmlformats.org/markup-compatibility/2006" xmlns:aink="http://schemas.microsoft.com/office/drawing/2016/ink" xmlns:am3d="http://schemas.microsoft.com/office/drawing/2017/model3d" xmlns:o="urn:schemas-microsoft-com:office:office" xmlns:oel="http://schemas.microsoft.com/office/2019/extlst" xmlns:r="http://schemas.openxmlformats.org/officeDocument/2006/relationships" xmlns:m="http://schemas.openxmlformats.org/officeDocument/2006/math" xmlns:v="urn:schemas-microsoft-com:vml" xmlns:wp14="http://schemas.microsoft.com/office/word/2010/wordprocessingDrawing" xmlns:wp="http://schemas.openxmlformats.org/drawingml/2006/wordprocessingDrawing" xmlns:w10="urn:schemas-microsoft-com:office:word" xmlns:w="http://schemas.openxmlformats.org/wordprocessingml/2006/main" xmlns:w14="http://schemas.microsoft.com/office/word/2010/wordml" xmlns:w15="http://schemas.microsoft.com/office/word/2012/wordml" xmlns:w16cex="http://schemas.microsoft.com/office/word/2018/wordml/cex" xmlns:w16cid="http://schemas.microsoft.com/office/word/2016/wordml/cid" xmlns:w16="http://schemas.microsoft.com/office/word/2018/wordml" xmlns:w16du="http://schemas.microsoft.com/office/word/2023/wordml/word16du" xmlns:w16sdtdh="http://schemas.microsoft.com/office/word/2020/wordml/sdtdatahash" xmlns:w16sdtfl="http://schemas.microsoft.com/office/word/2024/wordml/sdtformatlock" xmlns:w16se="http://schemas.microsoft.com/office/word/2015/wordml/symex" xmlns:wpg="http://schemas.microsoft.com/office/word/2010/wordprocessingGroup" xmlns:wpi="http://schemas.microsoft.com/office/word/2010/wordprocessingInk" xmlns:wne="http://schemas.microsoft.com/office/word/2006/wordml" xmlns:wps="http://schemas.microsoft.com/office/word/2010/wordprocessingShape" mc:Ignorable="w14 w15 w16se w16cid w16 w16cex w16sdtdh w16sdtfl w16du wp14">
+  <w:abstractNum w:abstractNumId="0" w15:restartNumberingAfterBreak="0">
+    <w:nsid w:val="08305C17"/>
+    <w:multiLevelType w:val="multilevel"/>
+    <w:tmpl w:val="5AD62A58"/>
+    <w:lvl w:ilvl="0">
+      <w:start w:val="1"/>
+      <w:numFmt w:val="bullet"/>
+      <w:lvlText w:val=""/>
+      <w:lvlJc w:val="left"/>
+      <w:pPr>
+        <w:tabs>
+          <w:tab w:val="num" w:pos="360"/>
+        </w:tabs>
+        <w:ind w:left="360" w:hanging="360"/>
+      </w:pPr>
+      <w:rPr>
+        <w:rFonts w:ascii="Symbol" w:hAnsi="Symbol" w:hint="default"/>
+        <w:sz w:val="20"/>
+      </w:rPr>
+    </w:lvl>
+    <w:lvl w:ilvl="1" w:tentative="1">
+      <w:start w:val="1"/>
+      <w:numFmt w:val="bullet"/>
+      <w:lvlText w:val="o"/>
+      <w:lvlJc w:val="left"/>
+      <w:pPr>
+        <w:tabs>
+          <w:tab w:val="num" w:pos="1080"/>
+        </w:tabs>
+        <w:ind w:left="1080" w:hanging="360"/>
+      </w:pPr>
+      <w:rPr>
+        <w:rFonts w:ascii="Courier New" w:hAnsi="Courier New" w:hint="default"/>
+        <w:sz w:val="20"/>
+      </w:rPr>
+    </w:lvl>
+    <w:lvl w:ilvl="2" w:tentative="1">
+      <w:start w:val="1"/>
+      <w:numFmt w:val="bullet"/>
+      <w:lvlText w:val=""/>
+      <w:lvlJc w:val="left"/>
+      <w:pPr>
+        <w:tabs>
+          <w:tab w:val="num" w:pos="1800"/>
+        </w:tabs>
+        <w:ind w:left="1800" w:hanging="360"/>
+      </w:pPr>
+      <w:rPr>
+        <w:rFonts w:ascii="Wingdings" w:hAnsi="Wingdings" w:hint="default"/>
+        <w:sz w:val="20"/>
+      </w:rPr>
+    </w:lvl>
+    <w:lvl w:ilvl="3" w:tentative="1">
+      <w:start w:val="1"/>
+      <w:numFmt w:val="bullet"/>
+      <w:lvlText w:val=""/>
+      <w:lvlJc w:val="left"/>
+      <w:pPr>
+        <w:tabs>
+          <w:tab w:val="num" w:pos="2520"/>
+        </w:tabs>
+        <w:ind w:left="2520" w:hanging="360"/>
+      </w:pPr>
+      <w:rPr>
+        <w:rFonts w:ascii="Wingdings" w:hAnsi="Wingdings" w:hint="default"/>
+        <w:sz w:val="20"/>
+      </w:rPr>
+    </w:lvl>
+    <w:lvl w:ilvl="4" w:tentative="1">
+      <w:start w:val="1"/>
+      <w:numFmt w:val="bullet"/>
+      <w:lvlText w:val=""/>
+      <w:lvlJc w:val="left"/>
+      <w:pPr>
+        <w:tabs>
+          <w:tab w:val="num" w:pos="3240"/>
+        </w:tabs>
+        <w:ind w:left="3240" w:hanging="360"/>
+      </w:pPr>
+      <w:rPr>
+        <w:rFonts w:ascii="Wingdings" w:hAnsi="Wingdings" w:hint="default"/>
+        <w:sz w:val="20"/>
+      </w:rPr>
+    </w:lvl>
+    <w:lvl w:ilvl="5" w:tentative="1">
+      <w:start w:val="1"/>
+      <w:numFmt w:val="bullet"/>
+      <w:lvlText w:val=""/>
+      <w:lvlJc w:val="left"/>
+      <w:pPr>
+        <w:tabs>
+          <w:tab w:val="num" w:pos="3960"/>
+        </w:tabs>
+        <w:ind w:left="3960" w:hanging="360"/>
+      </w:pPr>
+      <w:rPr>
+        <w:rFonts w:ascii="Wingdings" w:hAnsi="Wingdings" w:hint="default"/>
+        <w:sz w:val="20"/>
+      </w:rPr>
+    </w:lvl>
+    <w:lvl w:ilvl="6" w:tentative="1">
+      <w:start w:val="1"/>
+      <w:numFmt w:val="bullet"/>
+      <w:lvlText w:val=""/>
+      <w:lvlJc w:val="left"/>
+      <w:pPr>
+        <w:tabs>
+          <w:tab w:val="num" w:pos="4680"/>
+        </w:tabs>
+        <w:ind w:left="4680" w:hanging="360"/>
+      </w:pPr>
+      <w:rPr>
+        <w:rFonts w:ascii="Wingdings" w:hAnsi="Wingdings" w:hint="default"/>
+        <w:sz w:val="20"/>
+      </w:rPr>
+    </w:lvl>
+    <w:lvl w:ilvl="7" w:tentative="1">
+      <w:start w:val="1"/>
+      <w:numFmt w:val="bullet"/>
+      <w:lvlText w:val=""/>
+      <w:lvlJc w:val="left"/>
+      <w:pPr>
+        <w:tabs>
+          <w:tab w:val="num" w:pos="5400"/>
+        </w:tabs>
+        <w:ind w:left="5400" w:hanging="360"/>
+      </w:pPr>
+      <w:rPr>
+        <w:rFonts w:ascii="Wingdings" w:hAnsi="Wingdings" w:hint="default"/>
+        <w:sz w:val="20"/>
+      </w:rPr>
+    </w:lvl>
+    <w:lvl w:ilvl="8" w:tentative="1">
+      <w:start w:val="1"/>
+      <w:numFmt w:val="bullet"/>
+      <w:lvlText w:val=""/>
+      <w:lvlJc w:val="left"/>
+      <w:pPr>
+        <w:tabs>
+          <w:tab w:val="num" w:pos="6120"/>
+        </w:tabs>
+        <w:ind w:left="6120" w:hanging="360"/>
+      </w:pPr>
+      <w:rPr>
+        <w:rFonts w:ascii="Wingdings" w:hAnsi="Wingdings" w:hint="default"/>
+        <w:sz w:val="20"/>
+      </w:rPr>
+    </w:lvl>
+  </w:abstractNum>
+  <w:abstractNum w:abstractNumId="1" w15:restartNumberingAfterBreak="0">
+    <w:nsid w:val="183D1F40"/>
+    <w:multiLevelType w:val="multilevel"/>
+    <w:tmpl w:val="0718A80E"/>
+    <w:lvl w:ilvl="0">
+      <w:start w:val="1"/>
+      <w:numFmt w:val="bullet"/>
+      <w:lvlText w:val=""/>
+      <w:lvlJc w:val="left"/>
+      <w:pPr>
+        <w:tabs>
+          <w:tab w:val="num" w:pos="720"/>
+        </w:tabs>
+        <w:ind w:left="720" w:hanging="360"/>
+      </w:pPr>
+      <w:rPr>
+        <w:rFonts w:ascii="Symbol" w:hAnsi="Symbol" w:hint="default"/>
+        <w:sz w:val="20"/>
+      </w:rPr>
+    </w:lvl>
+    <w:lvl w:ilvl="1" w:tentative="1">
+      <w:start w:val="1"/>
+      <w:numFmt w:val="bullet"/>
+      <w:lvlText w:val="o"/>
+      <w:lvlJc w:val="left"/>
+      <w:pPr>
+        <w:tabs>
+          <w:tab w:val="num" w:pos="1440"/>
+        </w:tabs>
+        <w:ind w:left="1440" w:hanging="360"/>
+      </w:pPr>
+      <w:rPr>
+        <w:rFonts w:ascii="Courier New" w:hAnsi="Courier New" w:hint="default"/>
+        <w:sz w:val="20"/>
+      </w:rPr>
+    </w:lvl>
+    <w:lvl w:ilvl="2" w:tentative="1">
+      <w:start w:val="1"/>
+      <w:numFmt w:val="bullet"/>
+      <w:lvlText w:val=""/>
+      <w:lvlJc w:val="left"/>
+      <w:pPr>
+        <w:tabs>
+          <w:tab w:val="num" w:pos="2160"/>
+        </w:tabs>
+        <w:ind w:left="2160" w:hanging="360"/>
+      </w:pPr>
+      <w:rPr>
+        <w:rFonts w:ascii="Wingdings" w:hAnsi="Wingdings" w:hint="default"/>
+        <w:sz w:val="20"/>
+      </w:rPr>
+    </w:lvl>
+    <w:lvl w:ilvl="3" w:tentative="1">
+      <w:start w:val="1"/>
+      <w:numFmt w:val="bullet"/>
+      <w:lvlText w:val=""/>
+      <w:lvlJc w:val="left"/>
+      <w:pPr>
+        <w:tabs>
+          <w:tab w:val="num" w:pos="2880"/>
+        </w:tabs>
+        <w:ind w:left="2880" w:hanging="360"/>
+      </w:pPr>
+      <w:rPr>
+        <w:rFonts w:ascii="Wingdings" w:hAnsi="Wingdings" w:hint="default"/>
+        <w:sz w:val="20"/>
+      </w:rPr>
+    </w:lvl>
+    <w:lvl w:ilvl="4" w:tentative="1">
+      <w:start w:val="1"/>
+      <w:numFmt w:val="bullet"/>
+      <w:lvlText w:val=""/>
+      <w:lvlJc w:val="left"/>
+      <w:pPr>
+        <w:tabs>
+          <w:tab w:val="num" w:pos="3600"/>
+        </w:tabs>
+        <w:ind w:left="3600" w:hanging="360"/>
+      </w:pPr>
+      <w:rPr>
+        <w:rFonts w:ascii="Wingdings" w:hAnsi="Wingdings" w:hint="default"/>
+        <w:sz w:val="20"/>
+      </w:rPr>
+    </w:lvl>
+    <w:lvl w:ilvl="5" w:tentative="1">
+      <w:start w:val="1"/>
+      <w:numFmt w:val="bullet"/>
+      <w:lvlText w:val=""/>
+      <w:lvlJc w:val="left"/>
+      <w:pPr>
+        <w:tabs>
+          <w:tab w:val="num" w:pos="4320"/>
+        </w:tabs>
+        <w:ind w:left="4320" w:hanging="360"/>
+      </w:pPr>
+      <w:rPr>
+        <w:rFonts w:ascii="Wingdings" w:hAnsi="Wingdings" w:hint="default"/>
+        <w:sz w:val="20"/>
+      </w:rPr>
+    </w:lvl>
+    <w:lvl w:ilvl="6" w:tentative="1">
+      <w:start w:val="1"/>
+      <w:numFmt w:val="bullet"/>
+      <w:lvlText w:val=""/>
+      <w:lvlJc w:val="left"/>
+      <w:pPr>
+        <w:tabs>
+          <w:tab w:val="num" w:pos="5040"/>
+        </w:tabs>
+        <w:ind w:left="5040" w:hanging="360"/>
+      </w:pPr>
+      <w:rPr>
+        <w:rFonts w:ascii="Wingdings" w:hAnsi="Wingdings" w:hint="default"/>
+        <w:sz w:val="20"/>
+      </w:rPr>
+    </w:lvl>
+    <w:lvl w:ilvl="7" w:tentative="1">
+      <w:start w:val="1"/>
+      <w:numFmt w:val="bullet"/>
+      <w:lvlText w:val=""/>
+      <w:lvlJc w:val="left"/>
+      <w:pPr>
+        <w:tabs>
+          <w:tab w:val="num" w:pos="5760"/>
+        </w:tabs>
+        <w:ind w:left="5760" w:hanging="360"/>
+      </w:pPr>
+      <w:rPr>
+        <w:rFonts w:ascii="Wingdings" w:hAnsi="Wingdings" w:hint="default"/>
+        <w:sz w:val="20"/>
+      </w:rPr>
+    </w:lvl>
+    <w:lvl w:ilvl="8" w:tentative="1">
+      <w:start w:val="1"/>
+      <w:numFmt w:val="bullet"/>
+      <w:lvlText w:val=""/>
+      <w:lvlJc w:val="left"/>
+      <w:pPr>
+        <w:tabs>
+          <w:tab w:val="num" w:pos="6480"/>
+        </w:tabs>
+        <w:ind w:left="6480" w:hanging="360"/>
+      </w:pPr>
+      <w:rPr>
+        <w:rFonts w:ascii="Wingdings" w:hAnsi="Wingdings" w:hint="default"/>
+        <w:sz w:val="20"/>
+      </w:rPr>
+    </w:lvl>
+  </w:abstractNum>
+  <w:abstractNum w:abstractNumId="2" w15:restartNumberingAfterBreak="0">
+    <w:nsid w:val="2FA16DA6"/>
+    <w:multiLevelType w:val="hybridMultilevel"/>
+    <w:tmpl w:val="F6D627EE"/>
+    <w:lvl w:ilvl="0" w:tplc="20000001">
+      <w:start w:val="1"/>
+      <w:numFmt w:val="bullet"/>
+      <w:lvlText w:val=""/>
+      <w:lvlJc w:val="left"/>
+      <w:pPr>
+        <w:ind w:left="720" w:hanging="360"/>
+      </w:pPr>
+      <w:rPr>
+        <w:rFonts w:ascii="Symbol" w:hAnsi="Symbol" w:hint="default"/>
+      </w:rPr>
+    </w:lvl>
+    <w:lvl w:ilvl="1" w:tplc="20000003">
+      <w:start w:val="1"/>
+      <w:numFmt w:val="bullet"/>
+      <w:lvlText w:val="o"/>
+      <w:lvlJc w:val="left"/>
+      <w:pPr>
+        <w:ind w:left="1440" w:hanging="360"/>
+      </w:pPr>
+      <w:rPr>
+        <w:rFonts w:ascii="Courier New" w:hAnsi="Courier New" w:cs="Courier New" w:hint="default"/>
+      </w:rPr>
+    </w:lvl>
+    <w:lvl w:ilvl="2" w:tplc="20000005" w:tentative="1">
+      <w:start w:val="1"/>
+      <w:numFmt w:val="bullet"/>
+      <w:lvlText w:val=""/>
+      <w:lvlJc w:val="left"/>
+      <w:pPr>
+        <w:ind w:left="2160" w:hanging="360"/>
+      </w:pPr>
+      <w:rPr>
+        <w:rFonts w:ascii="Wingdings" w:hAnsi="Wingdings" w:hint="default"/>
+      </w:rPr>
+    </w:lvl>
+    <w:lvl w:ilvl="3" w:tplc="20000001" w:tentative="1">
+      <w:start w:val="1"/>
+      <w:numFmt w:val="bullet"/>
+      <w:lvlText w:val=""/>
+      <w:lvlJc w:val="left"/>
+      <w:pPr>
+        <w:ind w:left="2880" w:hanging="360"/>
+      </w:pPr>
+      <w:rPr>
+        <w:rFonts w:ascii="Symbol" w:hAnsi="Symbol" w:hint="default"/>
+      </w:rPr>
+    </w:lvl>
+    <w:lvl w:ilvl="4" w:tplc="20000003" w:tentative="1">
+      <w:start w:val="1"/>
+      <w:numFmt w:val="bullet"/>
+      <w:lvlText w:val="o"/>
+      <w:lvlJc w:val="left"/>
+      <w:pPr>
+        <w:ind w:left="3600" w:hanging="360"/>
+      </w:pPr>
+      <w:rPr>
+        <w:rFonts w:ascii="Courier New" w:hAnsi="Courier New" w:cs="Courier New" w:hint="default"/>
+      </w:rPr>
+    </w:lvl>
+    <w:lvl w:ilvl="5" w:tplc="20000005" w:tentative="1">
+      <w:start w:val="1"/>
+      <w:numFmt w:val="bullet"/>
+      <w:lvlText w:val=""/>
+      <w:lvlJc w:val="left"/>
+      <w:pPr>
+        <w:ind w:left="4320" w:hanging="360"/>
+      </w:pPr>
+      <w:rPr>
+        <w:rFonts w:ascii="Wingdings" w:hAnsi="Wingdings" w:hint="default"/>
+      </w:rPr>
+    </w:lvl>
+    <w:lvl w:ilvl="6" w:tplc="20000001" w:tentative="1">
+      <w:start w:val="1"/>
+      <w:numFmt w:val="bullet"/>
+      <w:lvlText w:val=""/>
+      <w:lvlJc w:val="left"/>
+      <w:pPr>
+        <w:ind w:left="5040" w:hanging="360"/>
+      </w:pPr>
+      <w:rPr>
+        <w:rFonts w:ascii="Symbol" w:hAnsi="Symbol" w:hint="default"/>
+      </w:rPr>
+    </w:lvl>
+    <w:lvl w:ilvl="7" w:tplc="20000003" w:tentative="1">
+      <w:start w:val="1"/>
+      <w:numFmt w:val="bullet"/>
+      <w:lvlText w:val="o"/>
+      <w:lvlJc w:val="left"/>
+      <w:pPr>
+        <w:ind w:left="5760" w:hanging="360"/>
+      </w:pPr>
+      <w:rPr>
+        <w:rFonts w:ascii="Courier New" w:hAnsi="Courier New" w:cs="Courier New" w:hint="default"/>
+      </w:rPr>
+    </w:lvl>
+    <w:lvl w:ilvl="8" w:tplc="20000005" w:tentative="1">
+      <w:start w:val="1"/>
+      <w:numFmt w:val="bullet"/>
+      <w:lvlText w:val=""/>
+      <w:lvlJc w:val="left"/>
+      <w:pPr>
+        <w:ind w:left="6480" w:hanging="360"/>
+      </w:pPr>
+      <w:rPr>
+        <w:rFonts w:ascii="Wingdings" w:hAnsi="Wingdings" w:hint="default"/>
+      </w:rPr>
+    </w:lvl>
+  </w:abstractNum>
+  <w:abstractNum w:abstractNumId="3" w15:restartNumberingAfterBreak="0">
+    <w:nsid w:val="468531D3"/>
+    <w:multiLevelType w:val="multilevel"/>
+    <w:tmpl w:val="2EB2B328"/>
+    <w:lvl w:ilvl="0">
+      <w:start w:val="1"/>
+      <w:numFmt w:val="bullet"/>
+      <w:lvlText w:val=""/>
+      <w:lvlJc w:val="left"/>
+      <w:pPr>
+        <w:tabs>
+          <w:tab w:val="num" w:pos="720"/>
+        </w:tabs>
+        <w:ind w:left="720" w:hanging="360"/>
+      </w:pPr>
+      <w:rPr>
+        <w:rFonts w:ascii="Symbol" w:hAnsi="Symbol" w:hint="default"/>
+        <w:sz w:val="20"/>
+      </w:rPr>
+    </w:lvl>
+    <w:lvl w:ilvl="1">
+      <w:start w:val="1"/>
+      <w:numFmt w:val="bullet"/>
+      <w:lvlText w:val="o"/>
+      <w:lvlJc w:val="left"/>
+      <w:pPr>
+        <w:tabs>
+          <w:tab w:val="num" w:pos="1440"/>
+        </w:tabs>
+        <w:ind w:left="1440" w:hanging="360"/>
+      </w:pPr>
+      <w:rPr>
+        <w:rFonts w:ascii="Courier New" w:hAnsi="Courier New" w:hint="default"/>
+        <w:sz w:val="20"/>
+      </w:rPr>
+    </w:lvl>
+    <w:lvl w:ilvl="2" w:tentative="1">
+      <w:start w:val="1"/>
+      <w:numFmt w:val="bullet"/>
+      <w:lvlText w:val=""/>
+      <w:lvlJc w:val="left"/>
+      <w:pPr>
+        <w:tabs>
+          <w:tab w:val="num" w:pos="2160"/>
+        </w:tabs>
+        <w:ind w:left="2160" w:hanging="360"/>
+      </w:pPr>
+      <w:rPr>
+        <w:rFonts w:ascii="Wingdings" w:hAnsi="Wingdings" w:hint="default"/>
+        <w:sz w:val="20"/>
+      </w:rPr>
+    </w:lvl>
+    <w:lvl w:ilvl="3" w:tentative="1">
+      <w:start w:val="1"/>
+      <w:numFmt w:val="bullet"/>
+      <w:lvlText w:val=""/>
+      <w:lvlJc w:val="left"/>
+      <w:pPr>
+        <w:tabs>
+          <w:tab w:val="num" w:pos="2880"/>
+        </w:tabs>
+        <w:ind w:left="2880" w:hanging="360"/>
+      </w:pPr>
+      <w:rPr>
+        <w:rFonts w:ascii="Wingdings" w:hAnsi="Wingdings" w:hint="default"/>
+        <w:sz w:val="20"/>
+      </w:rPr>
+    </w:lvl>
+    <w:lvl w:ilvl="4" w:tentative="1">
+      <w:start w:val="1"/>
+      <w:numFmt w:val="bullet"/>
+      <w:lvlText w:val=""/>
+      <w:lvlJc w:val="left"/>
+      <w:pPr>
+        <w:tabs>
+          <w:tab w:val="num" w:pos="3600"/>
+        </w:tabs>
+        <w:ind w:left="3600" w:hanging="360"/>
+      </w:pPr>
+      <w:rPr>
+        <w:rFonts w:ascii="Wingdings" w:hAnsi="Wingdings" w:hint="default"/>
+        <w:sz w:val="20"/>
+      </w:rPr>
+    </w:lvl>
+    <w:lvl w:ilvl="5" w:tentative="1">
+      <w:start w:val="1"/>
+      <w:numFmt w:val="bullet"/>
+      <w:lvlText w:val=""/>
+      <w:lvlJc w:val="left"/>
+      <w:pPr>
+        <w:tabs>
+          <w:tab w:val="num" w:pos="4320"/>
+        </w:tabs>
+        <w:ind w:left="4320" w:hanging="360"/>
+      </w:pPr>
+      <w:rPr>
+        <w:rFonts w:ascii="Wingdings" w:hAnsi="Wingdings" w:hint="default"/>
+        <w:sz w:val="20"/>
+      </w:rPr>
+    </w:lvl>
+    <w:lvl w:ilvl="6" w:tentative="1">
+      <w:start w:val="1"/>
+      <w:numFmt w:val="bullet"/>
+      <w:lvlText w:val=""/>
+      <w:lvlJc w:val="left"/>
+      <w:pPr>
+        <w:tabs>
+          <w:tab w:val="num" w:pos="5040"/>
+        </w:tabs>
+        <w:ind w:left="5040" w:hanging="360"/>
+      </w:pPr>
+      <w:rPr>
+        <w:rFonts w:ascii="Wingdings" w:hAnsi="Wingdings" w:hint="default"/>
+        <w:sz w:val="20"/>
+      </w:rPr>
+    </w:lvl>
+    <w:lvl w:ilvl="7" w:tentative="1">
+      <w:start w:val="1"/>
+      <w:numFmt w:val="bullet"/>
+      <w:lvlText w:val=""/>
+      <w:lvlJc w:val="left"/>
+      <w:pPr>
+        <w:tabs>
+          <w:tab w:val="num" w:pos="5760"/>
+        </w:tabs>
+        <w:ind w:left="5760" w:hanging="360"/>
+      </w:pPr>
+      <w:rPr>
+        <w:rFonts w:ascii="Wingdings" w:hAnsi="Wingdings" w:hint="default"/>
+        <w:sz w:val="20"/>
+      </w:rPr>
+    </w:lvl>
+    <w:lvl w:ilvl="8" w:tentative="1">
+      <w:start w:val="1"/>
+      <w:numFmt w:val="bullet"/>
+      <w:lvlText w:val=""/>
+      <w:lvlJc w:val="left"/>
+      <w:pPr>
+        <w:tabs>
+          <w:tab w:val="num" w:pos="6480"/>
+        </w:tabs>
+        <w:ind w:left="6480" w:hanging="360"/>
+      </w:pPr>
+      <w:rPr>
+        <w:rFonts w:ascii="Wingdings" w:hAnsi="Wingdings" w:hint="default"/>
+        <w:sz w:val="20"/>
+      </w:rPr>
+    </w:lvl>
+  </w:abstractNum>
+  <w:abstractNum w:abstractNumId="4" w15:restartNumberingAfterBreak="0">
+    <w:nsid w:val="4D266772"/>
+    <w:multiLevelType w:val="multilevel"/>
+    <w:tmpl w:val="A7AE706A"/>
+    <w:lvl w:ilvl="0">
+      <w:start w:val="1"/>
+      <w:numFmt w:val="bullet"/>
+      <w:lvlText w:val=""/>
+      <w:lvlJc w:val="left"/>
+      <w:pPr>
+        <w:tabs>
+          <w:tab w:val="num" w:pos="720"/>
+        </w:tabs>
+        <w:ind w:left="720" w:hanging="360"/>
+      </w:pPr>
+      <w:rPr>
+        <w:rFonts w:ascii="Symbol" w:hAnsi="Symbol" w:hint="default"/>
+        <w:sz w:val="20"/>
+      </w:rPr>
+    </w:lvl>
+    <w:lvl w:ilvl="1" w:tentative="1">
+      <w:start w:val="1"/>
+      <w:numFmt w:val="bullet"/>
+      <w:lvlText w:val="o"/>
+      <w:lvlJc w:val="left"/>
+      <w:pPr>
+        <w:tabs>
+          <w:tab w:val="num" w:pos="1440"/>
+        </w:tabs>
+        <w:ind w:left="1440" w:hanging="360"/>
+      </w:pPr>
+      <w:rPr>
+        <w:rFonts w:ascii="Courier New" w:hAnsi="Courier New" w:hint="default"/>
+        <w:sz w:val="20"/>
+      </w:rPr>
+    </w:lvl>
+    <w:lvl w:ilvl="2" w:tentative="1">
+      <w:start w:val="1"/>
+      <w:numFmt w:val="bullet"/>
+      <w:lvlText w:val=""/>
+      <w:lvlJc w:val="left"/>
+      <w:pPr>
+        <w:tabs>
+          <w:tab w:val="num" w:pos="2160"/>
+        </w:tabs>
+        <w:ind w:left="2160" w:hanging="360"/>
+      </w:pPr>
+      <w:rPr>
+        <w:rFonts w:ascii="Wingdings" w:hAnsi="Wingdings" w:hint="default"/>
+        <w:sz w:val="20"/>
+      </w:rPr>
+    </w:lvl>
+    <w:lvl w:ilvl="3" w:tentative="1">
+      <w:start w:val="1"/>
+      <w:numFmt w:val="bullet"/>
+      <w:lvlText w:val=""/>
+      <w:lvlJc w:val="left"/>
+      <w:pPr>
+        <w:tabs>
+          <w:tab w:val="num" w:pos="2880"/>
+        </w:tabs>
+        <w:ind w:left="2880" w:hanging="360"/>
+      </w:pPr>
+      <w:rPr>
+        <w:rFonts w:ascii="Wingdings" w:hAnsi="Wingdings" w:hint="default"/>
+        <w:sz w:val="20"/>
+      </w:rPr>
+    </w:lvl>
+    <w:lvl w:ilvl="4" w:tentative="1">
+      <w:start w:val="1"/>
+      <w:numFmt w:val="bullet"/>
+      <w:lvlText w:val=""/>
+      <w:lvlJc w:val="left"/>
+      <w:pPr>
+        <w:tabs>
+          <w:tab w:val="num" w:pos="3600"/>
+        </w:tabs>
+        <w:ind w:left="3600" w:hanging="360"/>
+      </w:pPr>
+      <w:rPr>
+        <w:rFonts w:ascii="Wingdings" w:hAnsi="Wingdings" w:hint="default"/>
+        <w:sz w:val="20"/>
+      </w:rPr>
+    </w:lvl>
+    <w:lvl w:ilvl="5" w:tentative="1">
+      <w:start w:val="1"/>
+      <w:numFmt w:val="bullet"/>
+      <w:lvlText w:val=""/>
+      <w:lvlJc w:val="left"/>
+      <w:pPr>
+        <w:tabs>
+          <w:tab w:val="num" w:pos="4320"/>
+        </w:tabs>
+        <w:ind w:left="4320" w:hanging="360"/>
+      </w:pPr>
+      <w:rPr>
+        <w:rFonts w:ascii="Wingdings" w:hAnsi="Wingdings" w:hint="default"/>
+        <w:sz w:val="20"/>
+      </w:rPr>
+    </w:lvl>
+    <w:lvl w:ilvl="6" w:tentative="1">
+      <w:start w:val="1"/>
+      <w:numFmt w:val="bullet"/>
+      <w:lvlText w:val=""/>
+      <w:lvlJc w:val="left"/>
+      <w:pPr>
+        <w:tabs>
+          <w:tab w:val="num" w:pos="5040"/>
+        </w:tabs>
+        <w:ind w:left="5040" w:hanging="360"/>
+      </w:pPr>
+      <w:rPr>
+        <w:rFonts w:ascii="Wingdings" w:hAnsi="Wingdings" w:hint="default"/>
+        <w:sz w:val="20"/>
+      </w:rPr>
+    </w:lvl>
+    <w:lvl w:ilvl="7" w:tentative="1">
+      <w:start w:val="1"/>
+      <w:numFmt w:val="bullet"/>
+      <w:lvlText w:val=""/>
+      <w:lvlJc w:val="left"/>
+      <w:pPr>
+        <w:tabs>
+          <w:tab w:val="num" w:pos="5760"/>
+        </w:tabs>
+        <w:ind w:left="5760" w:hanging="360"/>
+      </w:pPr>
+      <w:rPr>
+        <w:rFonts w:ascii="Wingdings" w:hAnsi="Wingdings" w:hint="default"/>
+        <w:sz w:val="20"/>
+      </w:rPr>
+    </w:lvl>
+    <w:lvl w:ilvl="8" w:tentative="1">
+      <w:start w:val="1"/>
+      <w:numFmt w:val="bullet"/>
+      <w:lvlText w:val=""/>
+      <w:lvlJc w:val="left"/>
+      <w:pPr>
+        <w:tabs>
+          <w:tab w:val="num" w:pos="6480"/>
+        </w:tabs>
+        <w:ind w:left="6480" w:hanging="360"/>
+      </w:pPr>
+      <w:rPr>
+        <w:rFonts w:ascii="Wingdings" w:hAnsi="Wingdings" w:hint="default"/>
+        <w:sz w:val="20"/>
+      </w:rPr>
+    </w:lvl>
+  </w:abstractNum>
+  <w:abstractNum w:abstractNumId="5" w15:restartNumberingAfterBreak="0">
+    <w:nsid w:val="59BA0223"/>
+    <w:multiLevelType w:val="hybridMultilevel"/>
+    <w:tmpl w:val="ED687486"/>
+    <w:lvl w:ilvl="0" w:tplc="20000019">
+      <w:start w:val="1"/>
+      <w:numFmt w:val="lowerLetter"/>
+      <w:lvlText w:val="%1."/>
+      <w:lvlJc w:val="left"/>
+      <w:pPr>
+        <w:ind w:left="927" w:hanging="360"/>
+      </w:pPr>
+      <w:rPr>
+        <w:rFonts w:hint="default"/>
+      </w:rPr>
+    </w:lvl>
+    <w:lvl w:ilvl="1" w:tplc="20000019" w:tentative="1">
+      <w:start w:val="1"/>
+      <w:numFmt w:val="lowerLetter"/>
+      <w:lvlText w:val="%2."/>
+      <w:lvlJc w:val="left"/>
+      <w:pPr>
+        <w:ind w:left="1440" w:hanging="360"/>
+      </w:pPr>
+    </w:lvl>
+    <w:lvl w:ilvl="2" w:tplc="2000001B" w:tentative="1">
+      <w:start w:val="1"/>
+      <w:numFmt w:val="lowerRoman"/>
+      <w:lvlText w:val="%3."/>
+      <w:lvlJc w:val="right"/>
+      <w:pPr>
+        <w:ind w:left="2160" w:hanging="180"/>
+      </w:pPr>
+    </w:lvl>
+    <w:lvl w:ilvl="3" w:tplc="2000000F" w:tentative="1">
+      <w:start w:val="1"/>
+      <w:numFmt w:val="decimal"/>
+      <w:lvlText w:val="%4."/>
+      <w:lvlJc w:val="left"/>
+      <w:pPr>
+        <w:ind w:left="2880" w:hanging="360"/>
+      </w:pPr>
+    </w:lvl>
+    <w:lvl w:ilvl="4" w:tplc="20000019" w:tentative="1">
+      <w:start w:val="1"/>
+      <w:numFmt w:val="lowerLetter"/>
+      <w:lvlText w:val="%5."/>
+      <w:lvlJc w:val="left"/>
+      <w:pPr>
+        <w:ind w:left="3600" w:hanging="360"/>
+      </w:pPr>
+    </w:lvl>
+    <w:lvl w:ilvl="5" w:tplc="2000001B" w:tentative="1">
+      <w:start w:val="1"/>
+      <w:numFmt w:val="lowerRoman"/>
+      <w:lvlText w:val="%6."/>
+      <w:lvlJc w:val="right"/>
+      <w:pPr>
+        <w:ind w:left="4320" w:hanging="180"/>
+      </w:pPr>
+    </w:lvl>
+    <w:lvl w:ilvl="6" w:tplc="2000000F" w:tentative="1">
+      <w:start w:val="1"/>
+      <w:numFmt w:val="decimal"/>
+      <w:lvlText w:val="%7."/>
+      <w:lvlJc w:val="left"/>
+      <w:pPr>
+        <w:ind w:left="5040" w:hanging="360"/>
+      </w:pPr>
+    </w:lvl>
+    <w:lvl w:ilvl="7" w:tplc="20000019" w:tentative="1">
+      <w:start w:val="1"/>
+      <w:numFmt w:val="lowerLetter"/>
+      <w:lvlText w:val="%8."/>
+      <w:lvlJc w:val="left"/>
+      <w:pPr>
+        <w:ind w:left="5760" w:hanging="360"/>
+      </w:pPr>
+    </w:lvl>
+    <w:lvl w:ilvl="8" w:tplc="2000001B" w:tentative="1">
+      <w:start w:val="1"/>
+      <w:numFmt w:val="lowerRoman"/>
+      <w:lvlText w:val="%9."/>
+      <w:lvlJc w:val="right"/>
+      <w:pPr>
+        <w:ind w:left="6480" w:hanging="180"/>
+      </w:pPr>
+    </w:lvl>
+  </w:abstractNum>
+  <w:abstractNum w:abstractNumId="6" w15:restartNumberingAfterBreak="0">
+    <w:nsid w:val="6369770A"/>
+    <w:multiLevelType w:val="multilevel"/>
+    <w:tmpl w:val="FCAE5D9A"/>
+    <w:lvl w:ilvl="0">
+      <w:start w:val="1"/>
+      <w:numFmt w:val="decimal"/>
+      <w:lvlText w:val="%1."/>
+      <w:lvlJc w:val="left"/>
+      <w:pPr>
+        <w:tabs>
+          <w:tab w:val="num" w:pos="720"/>
+        </w:tabs>
+        <w:ind w:left="720" w:hanging="360"/>
+      </w:pPr>
+    </w:lvl>
+    <w:lvl w:ilvl="1" w:tentative="1">
+      <w:start w:val="1"/>
+      <w:numFmt w:val="decimal"/>
+      <w:lvlText w:val="%2."/>
+      <w:lvlJc w:val="left"/>
+      <w:pPr>
+        <w:tabs>
+          <w:tab w:val="num" w:pos="1440"/>
+        </w:tabs>
+        <w:ind w:left="1440" w:hanging="360"/>
+      </w:pPr>
+    </w:lvl>
+    <w:lvl w:ilvl="2" w:tentative="1">
+      <w:start w:val="1"/>
+      <w:numFmt w:val="decimal"/>
+      <w:lvlText w:val="%3."/>
+      <w:lvlJc w:val="left"/>
+      <w:pPr>
+        <w:tabs>
+          <w:tab w:val="num" w:pos="2160"/>
+        </w:tabs>
+        <w:ind w:left="2160" w:hanging="360"/>
+      </w:pPr>
+    </w:lvl>
+    <w:lvl w:ilvl="3" w:tentative="1">
+      <w:start w:val="1"/>
+      <w:numFmt w:val="decimal"/>
+      <w:lvlText w:val="%4."/>
+      <w:lvlJc w:val="left"/>
+      <w:pPr>
+        <w:tabs>
+          <w:tab w:val="num" w:pos="2880"/>
+        </w:tabs>
+        <w:ind w:left="2880" w:hanging="360"/>
+      </w:pPr>
+    </w:lvl>
+    <w:lvl w:ilvl="4" w:tentative="1">
+      <w:start w:val="1"/>
+      <w:numFmt w:val="decimal"/>
+      <w:lvlText w:val="%5."/>
+      <w:lvlJc w:val="left"/>
+      <w:pPr>
+        <w:tabs>
+          <w:tab w:val="num" w:pos="3600"/>
+        </w:tabs>
+        <w:ind w:left="3600" w:hanging="360"/>
+      </w:pPr>
+    </w:lvl>
+    <w:lvl w:ilvl="5" w:tentative="1">
+      <w:start w:val="1"/>
+      <w:numFmt w:val="decimal"/>
+      <w:lvlText w:val="%6."/>
+      <w:lvlJc w:val="left"/>
+      <w:pPr>
+        <w:tabs>
+          <w:tab w:val="num" w:pos="4320"/>
+        </w:tabs>
+        <w:ind w:left="4320" w:hanging="360"/>
+      </w:pPr>
+    </w:lvl>
+    <w:lvl w:ilvl="6" w:tentative="1">
+      <w:start w:val="1"/>
+      <w:numFmt w:val="decimal"/>
+      <w:lvlText w:val="%7."/>
+      <w:lvlJc w:val="left"/>
+      <w:pPr>
+        <w:tabs>
+          <w:tab w:val="num" w:pos="5040"/>
+        </w:tabs>
+        <w:ind w:left="5040" w:hanging="360"/>
+      </w:pPr>
+    </w:lvl>
+    <w:lvl w:ilvl="7" w:tentative="1">
+      <w:start w:val="1"/>
+      <w:numFmt w:val="decimal"/>
+      <w:lvlText w:val="%8."/>
+      <w:lvlJc w:val="left"/>
+      <w:pPr>
+        <w:tabs>
+          <w:tab w:val="num" w:pos="5760"/>
+        </w:tabs>
+        <w:ind w:left="5760" w:hanging="360"/>
+      </w:pPr>
+    </w:lvl>
+    <w:lvl w:ilvl="8" w:tentative="1">
+      <w:start w:val="1"/>
+      <w:numFmt w:val="decimal"/>
+      <w:lvlText w:val="%9."/>
+      <w:lvlJc w:val="left"/>
+      <w:pPr>
+        <w:tabs>
+          <w:tab w:val="num" w:pos="6480"/>
+        </w:tabs>
+        <w:ind w:left="6480" w:hanging="360"/>
+      </w:pPr>
+    </w:lvl>
+  </w:abstractNum>
+  <w:abstractNum w:abstractNumId="7" w15:restartNumberingAfterBreak="0">
+    <w:nsid w:val="6D360DFB"/>
+    <w:multiLevelType w:val="multilevel"/>
+    <w:tmpl w:val="184C8404"/>
+    <w:lvl w:ilvl="0">
+      <w:start w:val="1"/>
+      <w:numFmt w:val="bullet"/>
+      <w:lvlText w:val=""/>
+      <w:lvlJc w:val="left"/>
+      <w:pPr>
+        <w:tabs>
+          <w:tab w:val="num" w:pos="720"/>
+        </w:tabs>
+        <w:ind w:left="720" w:hanging="360"/>
+      </w:pPr>
+      <w:rPr>
+        <w:rFonts w:ascii="Symbol" w:hAnsi="Symbol" w:hint="default"/>
+        <w:sz w:val="20"/>
+      </w:rPr>
+    </w:lvl>
+    <w:lvl w:ilvl="1" w:tentative="1">
+      <w:start w:val="1"/>
+      <w:numFmt w:val="bullet"/>
+      <w:lvlText w:val="o"/>
+      <w:lvlJc w:val="left"/>
+      <w:pPr>
+        <w:tabs>
+          <w:tab w:val="num" w:pos="1440"/>
+        </w:tabs>
+        <w:ind w:left="1440" w:hanging="360"/>
+      </w:pPr>
+      <w:rPr>
+        <w:rFonts w:ascii="Courier New" w:hAnsi="Courier New" w:hint="default"/>
+        <w:sz w:val="20"/>
+      </w:rPr>
+    </w:lvl>
+    <w:lvl w:ilvl="2" w:tentative="1">
+      <w:start w:val="1"/>
+      <w:numFmt w:val="bullet"/>
+      <w:lvlText w:val=""/>
+      <w:lvlJc w:val="left"/>
+      <w:pPr>
+        <w:tabs>
+          <w:tab w:val="num" w:pos="2160"/>
+        </w:tabs>
+        <w:ind w:left="2160" w:hanging="360"/>
+      </w:pPr>
+      <w:rPr>
+        <w:rFonts w:ascii="Wingdings" w:hAnsi="Wingdings" w:hint="default"/>
+        <w:sz w:val="20"/>
+      </w:rPr>
+    </w:lvl>
+    <w:lvl w:ilvl="3" w:tentative="1">
+      <w:start w:val="1"/>
+      <w:numFmt w:val="bullet"/>
+      <w:lvlText w:val=""/>
+      <w:lvlJc w:val="left"/>
+      <w:pPr>
+        <w:tabs>
+          <w:tab w:val="num" w:pos="2880"/>
+        </w:tabs>
+        <w:ind w:left="2880" w:hanging="360"/>
+      </w:pPr>
+      <w:rPr>
+        <w:rFonts w:ascii="Wingdings" w:hAnsi="Wingdings" w:hint="default"/>
+        <w:sz w:val="20"/>
+      </w:rPr>
+    </w:lvl>
+    <w:lvl w:ilvl="4" w:tentative="1">
+      <w:start w:val="1"/>
+      <w:numFmt w:val="bullet"/>
+      <w:lvlText w:val=""/>
+      <w:lvlJc w:val="left"/>
+      <w:pPr>
+        <w:tabs>
+          <w:tab w:val="num" w:pos="3600"/>
+        </w:tabs>
+        <w:ind w:left="3600" w:hanging="360"/>
+      </w:pPr>
+      <w:rPr>
+        <w:rFonts w:ascii="Wingdings" w:hAnsi="Wingdings" w:hint="default"/>
+        <w:sz w:val="20"/>
+      </w:rPr>
+    </w:lvl>
+    <w:lvl w:ilvl="5" w:tentative="1">
+      <w:start w:val="1"/>
+      <w:numFmt w:val="bullet"/>
+      <w:lvlText w:val=""/>
+      <w:lvlJc w:val="left"/>
+      <w:pPr>
+        <w:tabs>
+          <w:tab w:val="num" w:pos="4320"/>
+        </w:tabs>
+        <w:ind w:left="4320" w:hanging="360"/>
+      </w:pPr>
+      <w:rPr>
+        <w:rFonts w:ascii="Wingdings" w:hAnsi="Wingdings" w:hint="default"/>
+        <w:sz w:val="20"/>
+      </w:rPr>
+    </w:lvl>
+    <w:lvl w:ilvl="6" w:tentative="1">
+      <w:start w:val="1"/>
+      <w:numFmt w:val="bullet"/>
+      <w:lvlText w:val=""/>
+      <w:lvlJc w:val="left"/>
+      <w:pPr>
+        <w:tabs>
+          <w:tab w:val="num" w:pos="5040"/>
+        </w:tabs>
+        <w:ind w:left="5040" w:hanging="360"/>
+      </w:pPr>
+      <w:rPr>
+        <w:rFonts w:ascii="Wingdings" w:hAnsi="Wingdings" w:hint="default"/>
+        <w:sz w:val="20"/>
+      </w:rPr>
+    </w:lvl>
+    <w:lvl w:ilvl="7" w:tentative="1">
+      <w:start w:val="1"/>
+      <w:numFmt w:val="bullet"/>
+      <w:lvlText w:val=""/>
+      <w:lvlJc w:val="left"/>
+      <w:pPr>
+        <w:tabs>
+          <w:tab w:val="num" w:pos="5760"/>
+        </w:tabs>
+        <w:ind w:left="5760" w:hanging="360"/>
+      </w:pPr>
+      <w:rPr>
+        <w:rFonts w:ascii="Wingdings" w:hAnsi="Wingdings" w:hint="default"/>
+        <w:sz w:val="20"/>
+      </w:rPr>
+    </w:lvl>
+    <w:lvl w:ilvl="8" w:tentative="1">
+      <w:start w:val="1"/>
+      <w:numFmt w:val="bullet"/>
+      <w:lvlText w:val=""/>
+      <w:lvlJc w:val="left"/>
+      <w:pPr>
+        <w:tabs>
+          <w:tab w:val="num" w:pos="6480"/>
+        </w:tabs>
+        <w:ind w:left="6480" w:hanging="360"/>
+      </w:pPr>
+      <w:rPr>
+        <w:rFonts w:ascii="Wingdings" w:hAnsi="Wingdings" w:hint="default"/>
+        <w:sz w:val="20"/>
+      </w:rPr>
+    </w:lvl>
+  </w:abstractNum>
+  <w:abstractNum w:abstractNumId="8" w15:restartNumberingAfterBreak="0">
+    <w:nsid w:val="7AA26C11"/>
+    <w:multiLevelType w:val="multilevel"/>
+    <w:tmpl w:val="325A08EE"/>
+    <w:lvl w:ilvl="0">
+      <w:start w:val="1"/>
+      <w:numFmt w:val="bullet"/>
+      <w:lvlText w:val=""/>
+      <w:lvlJc w:val="left"/>
+      <w:pPr>
+        <w:tabs>
+          <w:tab w:val="num" w:pos="720"/>
+        </w:tabs>
+        <w:ind w:left="720" w:hanging="360"/>
+      </w:pPr>
+      <w:rPr>
+        <w:rFonts w:ascii="Symbol" w:hAnsi="Symbol" w:hint="default"/>
+        <w:sz w:val="20"/>
+      </w:rPr>
+    </w:lvl>
+    <w:lvl w:ilvl="1">
+      <w:start w:val="1"/>
+      <w:numFmt w:val="bullet"/>
+      <w:lvlText w:val="o"/>
+      <w:lvlJc w:val="left"/>
+      <w:pPr>
+        <w:tabs>
+          <w:tab w:val="num" w:pos="1440"/>
+        </w:tabs>
+        <w:ind w:left="1440" w:hanging="360"/>
+      </w:pPr>
+      <w:rPr>
+        <w:rFonts w:ascii="Courier New" w:hAnsi="Courier New" w:hint="default"/>
+        <w:sz w:val="20"/>
+      </w:rPr>
+    </w:lvl>
+    <w:lvl w:ilvl="2" w:tentative="1">
+      <w:start w:val="1"/>
+      <w:numFmt w:val="bullet"/>
+      <w:lvlText w:val=""/>
+      <w:lvlJc w:val="left"/>
+      <w:pPr>
+        <w:tabs>
+          <w:tab w:val="num" w:pos="2160"/>
+        </w:tabs>
+        <w:ind w:left="2160" w:hanging="360"/>
+      </w:pPr>
+      <w:rPr>
+        <w:rFonts w:ascii="Wingdings" w:hAnsi="Wingdings" w:hint="default"/>
+        <w:sz w:val="20"/>
+      </w:rPr>
+    </w:lvl>
+    <w:lvl w:ilvl="3" w:tentative="1">
+      <w:start w:val="1"/>
+      <w:numFmt w:val="bullet"/>
+      <w:lvlText w:val=""/>
+      <w:lvlJc w:val="left"/>
+      <w:pPr>
+        <w:tabs>
+          <w:tab w:val="num" w:pos="2880"/>
+        </w:tabs>
+        <w:ind w:left="2880" w:hanging="360"/>
+      </w:pPr>
+      <w:rPr>
+        <w:rFonts w:ascii="Wingdings" w:hAnsi="Wingdings" w:hint="default"/>
+        <w:sz w:val="20"/>
+      </w:rPr>
+    </w:lvl>
+    <w:lvl w:ilvl="4" w:tentative="1">
+      <w:start w:val="1"/>
+      <w:numFmt w:val="bullet"/>
+      <w:lvlText w:val=""/>
+      <w:lvlJc w:val="left"/>
+      <w:pPr>
+        <w:tabs>
+          <w:tab w:val="num" w:pos="3600"/>
+        </w:tabs>
+        <w:ind w:left="3600" w:hanging="360"/>
+      </w:pPr>
+      <w:rPr>
+        <w:rFonts w:ascii="Wingdings" w:hAnsi="Wingdings" w:hint="default"/>
+        <w:sz w:val="20"/>
+      </w:rPr>
+    </w:lvl>
+    <w:lvl w:ilvl="5" w:tentative="1">
+      <w:start w:val="1"/>
+      <w:numFmt w:val="bullet"/>
+      <w:lvlText w:val=""/>
+      <w:lvlJc w:val="left"/>
+      <w:pPr>
+        <w:tabs>
+          <w:tab w:val="num" w:pos="4320"/>
+        </w:tabs>
+        <w:ind w:left="4320" w:hanging="360"/>
+      </w:pPr>
+      <w:rPr>
+        <w:rFonts w:ascii="Wingdings" w:hAnsi="Wingdings" w:hint="default"/>
+        <w:sz w:val="20"/>
+      </w:rPr>
+    </w:lvl>
+    <w:lvl w:ilvl="6" w:tentative="1">
+      <w:start w:val="1"/>
+      <w:numFmt w:val="bullet"/>
+      <w:lvlText w:val=""/>
+      <w:lvlJc w:val="left"/>
+      <w:pPr>
+        <w:tabs>
+          <w:tab w:val="num" w:pos="5040"/>
+        </w:tabs>
+        <w:ind w:left="5040" w:hanging="360"/>
+      </w:pPr>
+      <w:rPr>
+        <w:rFonts w:ascii="Wingdings" w:hAnsi="Wingdings" w:hint="default"/>
+        <w:sz w:val="20"/>
+      </w:rPr>
+    </w:lvl>
+    <w:lvl w:ilvl="7" w:tentative="1">
+      <w:start w:val="1"/>
+      <w:numFmt w:val="bullet"/>
+      <w:lvlText w:val=""/>
+      <w:lvlJc w:val="left"/>
+      <w:pPr>
+        <w:tabs>
+          <w:tab w:val="num" w:pos="5760"/>
+        </w:tabs>
+        <w:ind w:left="5760" w:hanging="360"/>
+      </w:pPr>
+      <w:rPr>
+        <w:rFonts w:ascii="Wingdings" w:hAnsi="Wingdings" w:hint="default"/>
+        <w:sz w:val="20"/>
+      </w:rPr>
+    </w:lvl>
+    <w:lvl w:ilvl="8" w:tentative="1">
+      <w:start w:val="1"/>
+      <w:numFmt w:val="bullet"/>
+      <w:lvlText w:val=""/>
+      <w:lvlJc w:val="left"/>
+      <w:pPr>
+        <w:tabs>
+          <w:tab w:val="num" w:pos="6480"/>
+        </w:tabs>
+        <w:ind w:left="6480" w:hanging="360"/>
+      </w:pPr>
+      <w:rPr>
+        <w:rFonts w:ascii="Wingdings" w:hAnsi="Wingdings" w:hint="default"/>
+        <w:sz w:val="20"/>
+      </w:rPr>
+    </w:lvl>
+  </w:abstractNum>
+  <w:num w:numId="1" w16cid:durableId="1567183456">
+    <w:abstractNumId w:val="5"/>
+  </w:num>
+  <w:num w:numId="2" w16cid:durableId="1258365852">
+    <w:abstractNumId w:val="3"/>
+  </w:num>
+  <w:num w:numId="3" w16cid:durableId="1550535511">
+    <w:abstractNumId w:val="1"/>
+  </w:num>
+  <w:num w:numId="4" w16cid:durableId="1778326384">
+    <w:abstractNumId w:val="8"/>
+  </w:num>
+  <w:num w:numId="5" w16cid:durableId="1975332721">
+    <w:abstractNumId w:val="2"/>
+  </w:num>
+  <w:num w:numId="6" w16cid:durableId="811800015">
+    <w:abstractNumId w:val="6"/>
+  </w:num>
+  <w:num w:numId="7" w16cid:durableId="22295753">
+    <w:abstractNumId w:val="4"/>
+  </w:num>
+  <w:num w:numId="8" w16cid:durableId="2065711318">
+    <w:abstractNumId w:val="0"/>
+  </w:num>
+  <w:num w:numId="9" w16cid:durableId="2041590343">
+    <w:abstractNumId w:val="7"/>
+  </w:num>
+</w:numbering>
 </file>
 
 <file path=word/styles.xml><?xml version="1.0" encoding="utf-8"?>
@@ -721,7 +4503,6 @@
   <w:style w:type="character" w:default="1" w:styleId="DefaultParagraphFont">
     <w:name w:val="Default Paragraph Font"/>
     <w:uiPriority w:val="1"/>
-    <w:semiHidden/>
     <w:unhideWhenUsed/>
   </w:style>
   <w:style w:type="table" w:default="1" w:styleId="TableNormal">
@@ -1034,6 +4815,27 @@
       <w:spacing w:val="5"/>
     </w:rPr>
   </w:style>
+  <w:style w:type="character" w:styleId="PlaceholderText">
+    <w:name w:val="Placeholder Text"/>
+    <w:basedOn w:val="DefaultParagraphFont"/>
+    <w:uiPriority w:val="99"/>
+    <w:semiHidden/>
+    <w:rsid w:val="00EC7F8F"/>
+    <w:rPr>
+      <w:color w:val="666666"/>
+    </w:rPr>
+  </w:style>
+  <w:style w:type="character" w:styleId="Strong">
+    <w:name w:val="Strong"/>
+    <w:basedOn w:val="DefaultParagraphFont"/>
+    <w:uiPriority w:val="22"/>
+    <w:qFormat/>
+    <w:rsid w:val="00074CF4"/>
+    <w:rPr>
+      <w:b/>
+      <w:bCs/>
+    </w:rPr>
+  </w:style>
 </w:styles>
 </file>
 

</xml_diff>